<commit_message>
Write Introduction and Problem Definition
</commit_message>
<xml_diff>
--- a/Strategic thinking.docx
+++ b/Strategic thinking.docx
@@ -1402,6 +1402,35 @@
           <w14:ligatures w14:val="none"/>
         </w:rPr>
       </w:pPr>
+      <w:r>
+        <w:rPr>
+          <w:rFonts w:ascii="Calibri" w:eastAsia="Times New Roman" w:hAnsi="Calibri" w:cs="Calibri"/>
+          <w:kern w:val="0"/>
+          <w:lang w:val="en-IE" w:eastAsia="en-GB"/>
+          <w14:ligatures w14:val="none"/>
+        </w:rPr>
+        <w:t xml:space="preserve">The biggest challenge for OHS engineers and corporate leaders is that the psychological fatigue and burnout our usable threats. Unlike A faulty machine or a wet </w:t>
+      </w:r>
+      <w:proofErr w:type="gramStart"/>
+      <w:r>
+        <w:rPr>
+          <w:rFonts w:ascii="Calibri" w:eastAsia="Times New Roman" w:hAnsi="Calibri" w:cs="Calibri"/>
+          <w:kern w:val="0"/>
+          <w:lang w:val="en-IE" w:eastAsia="en-GB"/>
+          <w14:ligatures w14:val="none"/>
+        </w:rPr>
+        <w:t>saw</w:t>
+      </w:r>
+      <w:proofErr w:type="gramEnd"/>
+      <w:r>
+        <w:rPr>
+          <w:rFonts w:ascii="Calibri" w:eastAsia="Times New Roman" w:hAnsi="Calibri" w:cs="Calibri"/>
+          <w:kern w:val="0"/>
+          <w:lang w:val="en-IE" w:eastAsia="en-GB"/>
+          <w14:ligatures w14:val="none"/>
+        </w:rPr>
+        <w:t xml:space="preserve"> you cannot spot mental during a routine safety walk. Instead, factors like excessive overtime, extremely daily stress and poor sleep, accumulate quietly, steadily damaging the workers a daily safety performance.</w:t>
+      </w:r>
     </w:p>
     <w:p>
       <w:pPr>
@@ -1442,35 +1471,6 @@
           <w14:ligatures w14:val="none"/>
         </w:rPr>
       </w:pPr>
-      <w:r>
-        <w:rPr>
-          <w:rFonts w:ascii="Calibri" w:eastAsia="Times New Roman" w:hAnsi="Calibri" w:cs="Calibri"/>
-          <w:kern w:val="0"/>
-          <w:lang w:val="en-IE" w:eastAsia="en-GB"/>
-          <w14:ligatures w14:val="none"/>
-        </w:rPr>
-        <w:t xml:space="preserve">State the overall aim of the project and provide </w:t>
-      </w:r>
-      <w:r>
-        <w:rPr>
-          <w:rFonts w:ascii="Calibri" w:eastAsia="Times New Roman" w:hAnsi="Calibri" w:cs="Calibri"/>
-          <w:b/>
-          <w:bCs/>
-          <w:kern w:val="0"/>
-          <w:lang w:val="en-IE" w:eastAsia="en-GB"/>
-          <w14:ligatures w14:val="none"/>
-        </w:rPr>
-        <w:t>3–5 clear and achievable objectives</w:t>
-      </w:r>
-      <w:r>
-        <w:rPr>
-          <w:rFonts w:ascii="Calibri" w:eastAsia="Times New Roman" w:hAnsi="Calibri" w:cs="Calibri"/>
-          <w:kern w:val="0"/>
-          <w:lang w:val="en-IE" w:eastAsia="en-GB"/>
-          <w14:ligatures w14:val="none"/>
-        </w:rPr>
-        <w:t>. Include an appropriate business objective or hypothesis that will be explored through the project.</w:t>
-      </w:r>
     </w:p>
     <w:p>
       <w:pPr>

</xml_diff>

<commit_message>
Ethical and Legal Considerations
</commit_message>
<xml_diff>
--- a/Strategic thinking.docx
+++ b/Strategic thinking.docx
@@ -9,8 +9,6 @@
         <w:rPr>
           <w:rFonts w:ascii="Calibri" w:eastAsia="Calibri" w:hAnsi="Calibri" w:cs="Calibri"/>
           <w:kern w:val="0"/>
-          <w:sz w:val="22"/>
-          <w:szCs w:val="22"/>
           <w:lang w:val="en-IE"/>
           <w14:ligatures w14:val="none"/>
         </w:rPr>
@@ -20,8 +18,6 @@
           <w:rFonts w:ascii="Calibri" w:eastAsia="Calibri" w:hAnsi="Calibri" w:cs="Calibri"/>
           <w:noProof/>
           <w:kern w:val="0"/>
-          <w:sz w:val="22"/>
-          <w:szCs w:val="22"/>
           <w:lang w:val="en-IE"/>
           <w14:ligatures w14:val="none"/>
         </w:rPr>
@@ -82,8 +78,6 @@
         <w:rPr>
           <w:rFonts w:ascii="Calibri" w:eastAsia="Calibri" w:hAnsi="Calibri" w:cs="Calibri"/>
           <w:kern w:val="0"/>
-          <w:sz w:val="22"/>
-          <w:szCs w:val="22"/>
           <w:lang w:val="en-IE"/>
           <w14:ligatures w14:val="none"/>
         </w:rPr>
@@ -94,8 +88,6 @@
           <w:b/>
           <w:bCs/>
           <w:kern w:val="0"/>
-          <w:sz w:val="36"/>
-          <w:szCs w:val="36"/>
           <w:lang w:val="en-IE"/>
           <w14:ligatures w14:val="none"/>
         </w:rPr>
@@ -145,8 +137,6 @@
               <w:rPr>
                 <w:rFonts w:ascii="Calibri" w:eastAsia="Calibri" w:hAnsi="Calibri" w:cs="Calibri"/>
                 <w:kern w:val="0"/>
-                <w:sz w:val="22"/>
-                <w:szCs w:val="22"/>
                 <w:lang w:val="en-IE"/>
                 <w14:ligatures w14:val="none"/>
               </w:rPr>
@@ -157,8 +147,6 @@
                 <w:b/>
                 <w:bCs/>
                 <w:kern w:val="0"/>
-                <w:sz w:val="22"/>
-                <w:szCs w:val="22"/>
                 <w:lang w:val="en-IE"/>
                 <w14:ligatures w14:val="none"/>
               </w:rPr>
@@ -188,8 +176,6 @@
               <w:rPr>
                 <w:rFonts w:ascii="Calibri" w:eastAsia="Calibri" w:hAnsi="Calibri" w:cs="Calibri"/>
                 <w:kern w:val="0"/>
-                <w:sz w:val="22"/>
-                <w:szCs w:val="22"/>
                 <w:lang w:val="en-IE"/>
                 <w14:ligatures w14:val="none"/>
               </w:rPr>
@@ -222,8 +208,6 @@
               <w:rPr>
                 <w:rFonts w:ascii="Calibri" w:eastAsia="Calibri" w:hAnsi="Calibri" w:cs="Calibri"/>
                 <w:kern w:val="0"/>
-                <w:sz w:val="22"/>
-                <w:szCs w:val="22"/>
                 <w:lang w:val="en-IE"/>
                 <w14:ligatures w14:val="none"/>
               </w:rPr>
@@ -234,8 +218,6 @@
                 <w:b/>
                 <w:bCs/>
                 <w:kern w:val="0"/>
-                <w:sz w:val="22"/>
-                <w:szCs w:val="22"/>
                 <w:lang w:val="en-IE"/>
                 <w14:ligatures w14:val="none"/>
               </w:rPr>
@@ -265,8 +247,6 @@
               <w:rPr>
                 <w:rFonts w:ascii="Calibri" w:eastAsia="Calibri" w:hAnsi="Calibri" w:cs="Calibri"/>
                 <w:kern w:val="0"/>
-                <w:sz w:val="22"/>
-                <w:szCs w:val="22"/>
                 <w:lang w:val="en-IE"/>
                 <w14:ligatures w14:val="none"/>
               </w:rPr>
@@ -299,8 +279,6 @@
               <w:rPr>
                 <w:rFonts w:ascii="Calibri" w:eastAsia="Calibri" w:hAnsi="Calibri" w:cs="Calibri"/>
                 <w:kern w:val="0"/>
-                <w:sz w:val="22"/>
-                <w:szCs w:val="22"/>
                 <w:lang w:val="en-IE"/>
                 <w14:ligatures w14:val="none"/>
               </w:rPr>
@@ -311,8 +289,6 @@
                 <w:b/>
                 <w:bCs/>
                 <w:kern w:val="0"/>
-                <w:sz w:val="22"/>
-                <w:szCs w:val="22"/>
                 <w:lang w:val="en-IE"/>
                 <w14:ligatures w14:val="none"/>
               </w:rPr>
@@ -342,8 +318,6 @@
               <w:rPr>
                 <w:rFonts w:ascii="Calibri" w:eastAsia="Calibri" w:hAnsi="Calibri" w:cs="Calibri"/>
                 <w:kern w:val="0"/>
-                <w:sz w:val="22"/>
-                <w:szCs w:val="22"/>
                 <w:lang w:val="en-IE"/>
                 <w14:ligatures w14:val="none"/>
               </w:rPr>
@@ -376,8 +350,6 @@
               <w:rPr>
                 <w:rFonts w:ascii="Calibri" w:eastAsia="Calibri" w:hAnsi="Calibri" w:cs="Calibri"/>
                 <w:kern w:val="0"/>
-                <w:sz w:val="22"/>
-                <w:szCs w:val="22"/>
                 <w:lang w:val="en-IE"/>
                 <w14:ligatures w14:val="none"/>
               </w:rPr>
@@ -388,8 +360,6 @@
                 <w:b/>
                 <w:bCs/>
                 <w:kern w:val="0"/>
-                <w:sz w:val="22"/>
-                <w:szCs w:val="22"/>
                 <w:lang w:val="en-IE"/>
                 <w14:ligatures w14:val="none"/>
               </w:rPr>
@@ -419,8 +389,6 @@
               <w:rPr>
                 <w:rFonts w:ascii="Calibri" w:eastAsia="Calibri" w:hAnsi="Calibri" w:cs="Calibri"/>
                 <w:kern w:val="0"/>
-                <w:sz w:val="22"/>
-                <w:szCs w:val="22"/>
                 <w:lang w:val="en-IE"/>
                 <w14:ligatures w14:val="none"/>
               </w:rPr>
@@ -453,8 +421,6 @@
               <w:rPr>
                 <w:rFonts w:ascii="Calibri" w:eastAsia="Calibri" w:hAnsi="Calibri" w:cs="Calibri"/>
                 <w:kern w:val="0"/>
-                <w:sz w:val="22"/>
-                <w:szCs w:val="22"/>
                 <w:lang w:val="en-IE"/>
                 <w14:ligatures w14:val="none"/>
               </w:rPr>
@@ -465,8 +431,6 @@
                 <w:b/>
                 <w:bCs/>
                 <w:kern w:val="0"/>
-                <w:sz w:val="22"/>
-                <w:szCs w:val="22"/>
                 <w:lang w:val="en-IE"/>
                 <w14:ligatures w14:val="none"/>
               </w:rPr>
@@ -496,8 +460,6 @@
               <w:rPr>
                 <w:rFonts w:ascii="Calibri" w:eastAsia="Calibri" w:hAnsi="Calibri" w:cs="Calibri"/>
                 <w:kern w:val="0"/>
-                <w:sz w:val="22"/>
-                <w:szCs w:val="22"/>
                 <w:lang w:val="en-IE"/>
                 <w14:ligatures w14:val="none"/>
               </w:rPr>
@@ -530,8 +492,6 @@
               <w:rPr>
                 <w:rFonts w:ascii="Calibri" w:eastAsia="Calibri" w:hAnsi="Calibri" w:cs="Calibri"/>
                 <w:kern w:val="0"/>
-                <w:sz w:val="22"/>
-                <w:szCs w:val="22"/>
                 <w:lang w:val="en-IE"/>
                 <w14:ligatures w14:val="none"/>
               </w:rPr>
@@ -542,8 +502,6 @@
                 <w:b/>
                 <w:bCs/>
                 <w:kern w:val="0"/>
-                <w:sz w:val="22"/>
-                <w:szCs w:val="22"/>
                 <w:lang w:val="en-IE"/>
                 <w14:ligatures w14:val="none"/>
               </w:rPr>
@@ -573,8 +531,6 @@
               <w:rPr>
                 <w:rFonts w:ascii="Calibri" w:eastAsia="Calibri" w:hAnsi="Calibri" w:cs="Calibri"/>
                 <w:kern w:val="0"/>
-                <w:sz w:val="22"/>
-                <w:szCs w:val="22"/>
                 <w:lang w:val="en-IE"/>
                 <w14:ligatures w14:val="none"/>
               </w:rPr>
@@ -607,8 +563,6 @@
               <w:rPr>
                 <w:rFonts w:ascii="Calibri" w:eastAsia="Calibri" w:hAnsi="Calibri" w:cs="Calibri"/>
                 <w:kern w:val="0"/>
-                <w:sz w:val="22"/>
-                <w:szCs w:val="22"/>
                 <w:lang w:val="en-IE"/>
                 <w14:ligatures w14:val="none"/>
               </w:rPr>
@@ -619,8 +573,6 @@
                 <w:b/>
                 <w:bCs/>
                 <w:kern w:val="0"/>
-                <w:sz w:val="22"/>
-                <w:szCs w:val="22"/>
                 <w:lang w:val="en-IE"/>
                 <w14:ligatures w14:val="none"/>
               </w:rPr>
@@ -650,8 +602,6 @@
               <w:rPr>
                 <w:rFonts w:ascii="Calibri" w:eastAsia="Calibri" w:hAnsi="Calibri" w:cs="Calibri"/>
                 <w:kern w:val="0"/>
-                <w:sz w:val="22"/>
-                <w:szCs w:val="22"/>
                 <w:lang w:val="en-IE"/>
                 <w14:ligatures w14:val="none"/>
               </w:rPr>
@@ -670,8 +620,6 @@
           <w:bCs/>
           <w:color w:val="000000"/>
           <w:kern w:val="0"/>
-          <w:sz w:val="32"/>
-          <w:szCs w:val="32"/>
           <w:lang w:val="en-IE"/>
           <w14:ligatures w14:val="none"/>
         </w:rPr>
@@ -683,8 +631,6 @@
           <w:bCs/>
           <w:color w:val="000000"/>
           <w:kern w:val="0"/>
-          <w:sz w:val="32"/>
-          <w:szCs w:val="32"/>
           <w:lang w:val="en-IE"/>
           <w14:ligatures w14:val="none"/>
         </w:rPr>
@@ -697,8 +643,6 @@
         <w:rPr>
           <w:rFonts w:ascii="Calibri" w:eastAsia="Calibri" w:hAnsi="Calibri" w:cs="Calibri"/>
           <w:kern w:val="0"/>
-          <w:sz w:val="22"/>
-          <w:szCs w:val="22"/>
           <w:lang w:val="en-IE"/>
           <w14:ligatures w14:val="none"/>
         </w:rPr>
@@ -707,8 +651,6 @@
         <w:rPr>
           <w:rFonts w:ascii="Calibri" w:eastAsia="Calibri" w:hAnsi="Calibri" w:cs="Calibri"/>
           <w:kern w:val="0"/>
-          <w:sz w:val="22"/>
-          <w:szCs w:val="22"/>
           <w:lang w:val="en-IE"/>
           <w14:ligatures w14:val="none"/>
         </w:rPr>
@@ -757,8 +699,6 @@
               <w:rPr>
                 <w:rFonts w:ascii="Calibri" w:eastAsia="Calibri" w:hAnsi="Calibri" w:cs="Calibri"/>
                 <w:kern w:val="0"/>
-                <w:sz w:val="22"/>
-                <w:szCs w:val="22"/>
                 <w:lang w:val="en-IE"/>
                 <w14:ligatures w14:val="none"/>
               </w:rPr>
@@ -769,8 +709,6 @@
                 <w:b/>
                 <w:bCs/>
                 <w:kern w:val="0"/>
-                <w:sz w:val="22"/>
-                <w:szCs w:val="22"/>
                 <w:lang w:val="en-IE"/>
                 <w14:ligatures w14:val="none"/>
               </w:rPr>
@@ -783,8 +721,6 @@
               <w:rPr>
                 <w:rFonts w:ascii="Calibri" w:eastAsia="Calibri" w:hAnsi="Calibri" w:cs="Calibri"/>
                 <w:kern w:val="0"/>
-                <w:sz w:val="22"/>
-                <w:szCs w:val="22"/>
                 <w:lang w:val="en-IE"/>
                 <w14:ligatures w14:val="none"/>
               </w:rPr>
@@ -793,8 +729,6 @@
               <w:rPr>
                 <w:rFonts w:ascii="Calibri" w:eastAsia="Calibri" w:hAnsi="Calibri" w:cs="Calibri"/>
                 <w:kern w:val="0"/>
-                <w:sz w:val="22"/>
-                <w:szCs w:val="22"/>
                 <w:lang w:val="en-IE"/>
                 <w14:ligatures w14:val="none"/>
               </w:rPr>
@@ -825,8 +759,6 @@
               <w:rPr>
                 <w:rFonts w:ascii="Calibri" w:eastAsia="Calibri" w:hAnsi="Calibri" w:cs="Calibri"/>
                 <w:kern w:val="0"/>
-                <w:sz w:val="22"/>
-                <w:szCs w:val="22"/>
                 <w:lang w:val="en-IE"/>
                 <w14:ligatures w14:val="none"/>
               </w:rPr>
@@ -837,8 +769,6 @@
                 <w:b/>
                 <w:bCs/>
                 <w:kern w:val="0"/>
-                <w:sz w:val="22"/>
-                <w:szCs w:val="22"/>
                 <w:lang w:val="en-IE"/>
                 <w14:ligatures w14:val="none"/>
               </w:rPr>
@@ -851,8 +781,6 @@
               <w:rPr>
                 <w:rFonts w:ascii="Calibri" w:eastAsia="Calibri" w:hAnsi="Calibri" w:cs="Calibri"/>
                 <w:kern w:val="0"/>
-                <w:sz w:val="22"/>
-                <w:szCs w:val="22"/>
                 <w:lang w:val="en-IE"/>
                 <w14:ligatures w14:val="none"/>
               </w:rPr>
@@ -861,8 +789,6 @@
               <w:rPr>
                 <w:rFonts w:ascii="Calibri" w:eastAsia="Calibri" w:hAnsi="Calibri" w:cs="Calibri"/>
                 <w:kern w:val="0"/>
-                <w:sz w:val="22"/>
-                <w:szCs w:val="22"/>
                 <w:lang w:val="en-IE"/>
                 <w14:ligatures w14:val="none"/>
               </w:rPr>
@@ -895,8 +821,6 @@
               <w:rPr>
                 <w:rFonts w:ascii="Calibri" w:eastAsia="Calibri" w:hAnsi="Calibri" w:cs="Calibri"/>
                 <w:kern w:val="0"/>
-                <w:sz w:val="22"/>
-                <w:szCs w:val="22"/>
                 <w:lang w:val="en-IE"/>
                 <w14:ligatures w14:val="none"/>
               </w:rPr>
@@ -907,8 +831,6 @@
                 <w:b/>
                 <w:bCs/>
                 <w:kern w:val="0"/>
-                <w:sz w:val="22"/>
-                <w:szCs w:val="22"/>
                 <w:lang w:val="en-IE"/>
                 <w14:ligatures w14:val="none"/>
               </w:rPr>
@@ -921,8 +843,6 @@
               <w:rPr>
                 <w:rFonts w:ascii="Calibri" w:eastAsia="Calibri" w:hAnsi="Calibri" w:cs="Calibri"/>
                 <w:kern w:val="0"/>
-                <w:sz w:val="22"/>
-                <w:szCs w:val="22"/>
                 <w:lang w:val="en-IE"/>
                 <w14:ligatures w14:val="none"/>
               </w:rPr>
@@ -931,8 +851,6 @@
               <w:rPr>
                 <w:rFonts w:ascii="Calibri" w:eastAsia="Calibri" w:hAnsi="Calibri" w:cs="Calibri"/>
                 <w:kern w:val="0"/>
-                <w:sz w:val="22"/>
-                <w:szCs w:val="22"/>
                 <w:lang w:val="en-IE"/>
                 <w14:ligatures w14:val="none"/>
               </w:rPr>
@@ -963,8 +881,6 @@
               <w:rPr>
                 <w:rFonts w:ascii="Calibri" w:eastAsia="Calibri" w:hAnsi="Calibri" w:cs="Calibri"/>
                 <w:kern w:val="0"/>
-                <w:sz w:val="22"/>
-                <w:szCs w:val="22"/>
                 <w:lang w:val="en-IE"/>
                 <w14:ligatures w14:val="none"/>
               </w:rPr>
@@ -975,8 +891,6 @@
                 <w:b/>
                 <w:bCs/>
                 <w:kern w:val="0"/>
-                <w:sz w:val="22"/>
-                <w:szCs w:val="22"/>
                 <w:lang w:val="en-IE"/>
                 <w14:ligatures w14:val="none"/>
               </w:rPr>
@@ -989,8 +903,6 @@
               <w:rPr>
                 <w:rFonts w:ascii="Calibri" w:eastAsia="Calibri" w:hAnsi="Calibri" w:cs="Calibri"/>
                 <w:kern w:val="0"/>
-                <w:sz w:val="22"/>
-                <w:szCs w:val="22"/>
                 <w:lang w:val="en-IE"/>
                 <w14:ligatures w14:val="none"/>
               </w:rPr>
@@ -999,8 +911,6 @@
               <w:rPr>
                 <w:rFonts w:ascii="Calibri" w:eastAsia="Calibri" w:hAnsi="Calibri" w:cs="Calibri"/>
                 <w:kern w:val="0"/>
-                <w:sz w:val="22"/>
-                <w:szCs w:val="22"/>
                 <w:lang w:val="en-IE"/>
                 <w14:ligatures w14:val="none"/>
               </w:rPr>
@@ -1016,8 +926,6 @@
         <w:rPr>
           <w:rFonts w:ascii="Calibri" w:eastAsia="Calibri" w:hAnsi="Calibri" w:cs="Calibri"/>
           <w:kern w:val="0"/>
-          <w:sz w:val="22"/>
-          <w:szCs w:val="22"/>
           <w:lang w:val="en-IE"/>
           <w14:ligatures w14:val="none"/>
         </w:rPr>
@@ -1028,8 +936,6 @@
           <w:i/>
           <w:iCs/>
           <w:kern w:val="0"/>
-          <w:sz w:val="20"/>
-          <w:szCs w:val="20"/>
           <w:lang w:val="en-IE"/>
           <w14:ligatures w14:val="none"/>
         </w:rPr>
@@ -1043,8 +949,6 @@
             <w:iCs/>
             <w:color w:val="0563C1"/>
             <w:kern w:val="0"/>
-            <w:sz w:val="20"/>
-            <w:szCs w:val="20"/>
             <w:u w:val="single"/>
             <w:lang w:val="en-IE"/>
             <w14:ligatures w14:val="none"/>
@@ -1058,8 +962,6 @@
           <w:i/>
           <w:iCs/>
           <w:kern w:val="0"/>
-          <w:sz w:val="20"/>
-          <w:szCs w:val="20"/>
           <w:lang w:val="en-IE"/>
           <w14:ligatures w14:val="none"/>
         </w:rPr>
@@ -1072,8 +974,6 @@
           <w:i/>
           <w:iCs/>
           <w:kern w:val="0"/>
-          <w:sz w:val="20"/>
-          <w:szCs w:val="20"/>
           <w:lang w:val="en-IE"/>
           <w14:ligatures w14:val="none"/>
         </w:rPr>
@@ -1086,8 +986,6 @@
           <w:i/>
           <w:iCs/>
           <w:kern w:val="0"/>
-          <w:sz w:val="20"/>
-          <w:szCs w:val="20"/>
           <w:lang w:val="en-IE"/>
           <w14:ligatures w14:val="none"/>
         </w:rPr>
@@ -1133,8 +1031,6 @@
         <w:rPr>
           <w:rFonts w:ascii="Calibri" w:eastAsia="Calibri" w:hAnsi="Calibri" w:cs="Calibri"/>
           <w:kern w:val="0"/>
-          <w:sz w:val="22"/>
-          <w:szCs w:val="22"/>
           <w:lang w:val="en-IE"/>
           <w14:ligatures w14:val="none"/>
         </w:rPr>
@@ -1143,8 +1039,6 @@
         <w:rPr>
           <w:rFonts w:ascii="Calibri" w:eastAsia="Calibri" w:hAnsi="Calibri" w:cs="Calibri"/>
           <w:kern w:val="0"/>
-          <w:sz w:val="22"/>
-          <w:szCs w:val="22"/>
           <w:lang w:val="en-IE"/>
           <w14:ligatures w14:val="none"/>
         </w:rPr>
@@ -1161,8 +1055,6 @@
         <w:rPr>
           <w:rFonts w:ascii="Calibri" w:eastAsia="Calibri" w:hAnsi="Calibri" w:cs="Calibri"/>
           <w:kern w:val="0"/>
-          <w:sz w:val="22"/>
-          <w:szCs w:val="22"/>
           <w:lang w:val="en-IE"/>
           <w14:ligatures w14:val="none"/>
         </w:rPr>
@@ -1171,8 +1063,6 @@
         <w:rPr>
           <w:rFonts w:ascii="Calibri" w:eastAsia="Calibri" w:hAnsi="Calibri" w:cs="Calibri"/>
           <w:kern w:val="0"/>
-          <w:sz w:val="22"/>
-          <w:szCs w:val="22"/>
           <w:lang w:val="en-IE"/>
           <w14:ligatures w14:val="none"/>
         </w:rPr>
@@ -1221,8 +1111,6 @@
           <w:rFonts w:ascii="Calibri" w:eastAsia="Calibri" w:hAnsi="Calibri" w:cs="Calibri"/>
           <w:b/>
           <w:kern w:val="0"/>
-          <w:sz w:val="48"/>
-          <w:szCs w:val="48"/>
           <w:lang w:val="en-IE" w:eastAsia="en-IE"/>
           <w14:ligatures w14:val="none"/>
         </w:rPr>
@@ -1232,8 +1120,6 @@
           <w:rFonts w:ascii="Calibri" w:eastAsia="Calibri" w:hAnsi="Calibri" w:cs="Calibri"/>
           <w:b/>
           <w:kern w:val="0"/>
-          <w:sz w:val="48"/>
-          <w:szCs w:val="48"/>
           <w:lang w:val="en-IE" w:eastAsia="en-IE"/>
           <w14:ligatures w14:val="none"/>
         </w:rPr>
@@ -1251,8 +1137,6 @@
           <w:rFonts w:ascii="Calibri" w:eastAsia="Calibri" w:hAnsi="Calibri" w:cs="Calibri"/>
           <w:b/>
           <w:kern w:val="0"/>
-          <w:sz w:val="28"/>
-          <w:szCs w:val="28"/>
           <w:lang w:val="en-IE" w:eastAsia="en-IE"/>
           <w14:ligatures w14:val="none"/>
         </w:rPr>
@@ -1264,8 +1148,6 @@
           <w:rFonts w:ascii="Calibri" w:eastAsia="Calibri" w:hAnsi="Calibri" w:cs="Calibri"/>
           <w:b/>
           <w:kern w:val="0"/>
-          <w:sz w:val="28"/>
-          <w:szCs w:val="28"/>
           <w:lang w:val="en-IE" w:eastAsia="en-IE"/>
           <w14:ligatures w14:val="none"/>
         </w:rPr>
@@ -1307,8 +1189,6 @@
           <w:rFonts w:ascii="Calibri" w:eastAsia="Calibri" w:hAnsi="Calibri" w:cs="Calibri"/>
           <w:b/>
           <w:kern w:val="0"/>
-          <w:sz w:val="28"/>
-          <w:szCs w:val="28"/>
           <w:lang w:val="en-IE" w:eastAsia="en-IE"/>
           <w14:ligatures w14:val="none"/>
         </w:rPr>
@@ -1318,8 +1198,6 @@
           <w:rFonts w:ascii="Calibri" w:eastAsia="Calibri" w:hAnsi="Calibri" w:cs="Calibri"/>
           <w:b/>
           <w:kern w:val="0"/>
-          <w:sz w:val="28"/>
-          <w:szCs w:val="28"/>
           <w:lang w:val="en-IE" w:eastAsia="en-IE"/>
           <w14:ligatures w14:val="none"/>
         </w:rPr>
@@ -1385,8 +1263,6 @@
           <w:rFonts w:ascii="Calibri" w:eastAsia="Calibri" w:hAnsi="Calibri" w:cs="Calibri"/>
           <w:b/>
           <w:kern w:val="0"/>
-          <w:sz w:val="28"/>
-          <w:szCs w:val="28"/>
           <w:lang w:val="en-IE" w:eastAsia="en-IE"/>
           <w14:ligatures w14:val="none"/>
         </w:rPr>
@@ -1396,8 +1272,6 @@
           <w:rFonts w:ascii="Calibri" w:eastAsia="Calibri" w:hAnsi="Calibri" w:cs="Calibri"/>
           <w:b/>
           <w:kern w:val="0"/>
-          <w:sz w:val="28"/>
-          <w:szCs w:val="28"/>
           <w:lang w:val="en-IE" w:eastAsia="en-IE"/>
           <w14:ligatures w14:val="none"/>
         </w:rPr>
@@ -1510,8 +1384,6 @@
           <w:rFonts w:ascii="Calibri" w:eastAsia="Calibri" w:hAnsi="Calibri" w:cs="Calibri"/>
           <w:b/>
           <w:kern w:val="0"/>
-          <w:sz w:val="28"/>
-          <w:szCs w:val="28"/>
           <w:lang w:val="en-IE" w:eastAsia="en-IE"/>
           <w14:ligatures w14:val="none"/>
         </w:rPr>
@@ -1521,8 +1393,6 @@
           <w:rFonts w:ascii="Calibri" w:eastAsia="Calibri" w:hAnsi="Calibri" w:cs="Calibri"/>
           <w:b/>
           <w:kern w:val="0"/>
-          <w:sz w:val="28"/>
-          <w:szCs w:val="28"/>
           <w:lang w:val="en-IE" w:eastAsia="en-IE"/>
           <w14:ligatures w14:val="none"/>
         </w:rPr>
@@ -1588,8 +1458,6 @@
           <w:b/>
           <w:bCs/>
           <w:kern w:val="0"/>
-          <w:sz w:val="28"/>
-          <w:szCs w:val="28"/>
           <w:lang w:val="en-IE" w:eastAsia="en-GB"/>
           <w14:ligatures w14:val="none"/>
         </w:rPr>
@@ -1600,12 +1468,9 @@
           <w:b/>
           <w:bCs/>
           <w:kern w:val="0"/>
-          <w:sz w:val="28"/>
-          <w:szCs w:val="28"/>
           <w:lang w:val="en-IE" w:eastAsia="en-GB"/>
           <w14:ligatures w14:val="none"/>
         </w:rPr>
-        <w:lastRenderedPageBreak/>
         <w:t>Project objectives</w:t>
       </w:r>
     </w:p>
@@ -1624,8 +1489,6 @@
           <w:rFonts w:ascii="Calibri" w:eastAsia="MS Mincho" w:hAnsi="Calibri" w:cs="Calibri"/>
           <w:color w:val="333333"/>
           <w:kern w:val="0"/>
-          <w:sz w:val="22"/>
-          <w:szCs w:val="22"/>
           <w14:ligatures w14:val="none"/>
         </w:rPr>
       </w:pPr>
@@ -1635,10 +1498,9 @@
           <w:b/>
           <w:color w:val="333333"/>
           <w:kern w:val="0"/>
-          <w:sz w:val="22"/>
-          <w:szCs w:val="22"/>
-          <w14:ligatures w14:val="none"/>
-        </w:rPr>
+          <w14:ligatures w14:val="none"/>
+        </w:rPr>
+        <w:lastRenderedPageBreak/>
         <w:t xml:space="preserve">Data Ingestion &amp; EDA: </w:t>
       </w:r>
       <w:r>
@@ -1646,8 +1508,6 @@
           <w:rFonts w:ascii="Calibri" w:eastAsia="MS Mincho" w:hAnsi="Calibri" w:cs="Calibri"/>
           <w:color w:val="333333"/>
           <w:kern w:val="0"/>
-          <w:sz w:val="22"/>
-          <w:szCs w:val="22"/>
           <w14:ligatures w14:val="none"/>
         </w:rPr>
         <w:t>To ingest, clean, and run an exhaustive Exploratory Data Analysis (EDA) on a corporate well-being and safety dataset of 1,500+ records to ensure total data integrity.</w:t>
@@ -1668,8 +1528,6 @@
           <w:rFonts w:ascii="Calibri" w:eastAsia="MS Mincho" w:hAnsi="Calibri" w:cs="Calibri"/>
           <w:color w:val="333333"/>
           <w:kern w:val="0"/>
-          <w:sz w:val="22"/>
-          <w:szCs w:val="22"/>
           <w14:ligatures w14:val="none"/>
         </w:rPr>
       </w:pPr>
@@ -1679,8 +1537,6 @@
           <w:b/>
           <w:color w:val="333333"/>
           <w:kern w:val="0"/>
-          <w:sz w:val="22"/>
-          <w:szCs w:val="22"/>
           <w14:ligatures w14:val="none"/>
         </w:rPr>
         <w:t xml:space="preserve">Feature Engineering: </w:t>
@@ -1690,8 +1546,6 @@
           <w:rFonts w:ascii="Calibri" w:eastAsia="MS Mincho" w:hAnsi="Calibri" w:cs="Calibri"/>
           <w:color w:val="333333"/>
           <w:kern w:val="0"/>
-          <w:sz w:val="22"/>
-          <w:szCs w:val="22"/>
           <w14:ligatures w14:val="none"/>
         </w:rPr>
         <w:t>To perform feature engineering and selection to map the statistical links between psychosocial variables and historical burnout outcomes.</w:t>
@@ -1712,8 +1566,6 @@
           <w:rFonts w:ascii="Calibri" w:eastAsia="MS Mincho" w:hAnsi="Calibri" w:cs="Calibri"/>
           <w:color w:val="333333"/>
           <w:kern w:val="0"/>
-          <w:sz w:val="22"/>
-          <w:szCs w:val="22"/>
           <w14:ligatures w14:val="none"/>
         </w:rPr>
       </w:pPr>
@@ -1723,8 +1575,6 @@
           <w:b/>
           <w:color w:val="333333"/>
           <w:kern w:val="0"/>
-          <w:sz w:val="22"/>
-          <w:szCs w:val="22"/>
           <w14:ligatures w14:val="none"/>
         </w:rPr>
         <w:t xml:space="preserve">Model Development: </w:t>
@@ -1734,8 +1584,6 @@
           <w:rFonts w:ascii="Calibri" w:eastAsia="MS Mincho" w:hAnsi="Calibri" w:cs="Calibri"/>
           <w:color w:val="333333"/>
           <w:kern w:val="0"/>
-          <w:sz w:val="22"/>
-          <w:szCs w:val="22"/>
           <w14:ligatures w14:val="none"/>
         </w:rPr>
         <w:t xml:space="preserve">To train, optimize, and cross-validate three distinct machine learning models—Logistic Regression, Random Forest, and </w:t>
@@ -1746,8 +1594,6 @@
           <w:rFonts w:ascii="Calibri" w:eastAsia="MS Mincho" w:hAnsi="Calibri" w:cs="Calibri"/>
           <w:color w:val="333333"/>
           <w:kern w:val="0"/>
-          <w:sz w:val="22"/>
-          <w:szCs w:val="22"/>
           <w14:ligatures w14:val="none"/>
         </w:rPr>
         <w:t>LightGBM</w:t>
@@ -1758,8 +1604,6 @@
           <w:rFonts w:ascii="Calibri" w:eastAsia="MS Mincho" w:hAnsi="Calibri" w:cs="Calibri"/>
           <w:color w:val="333333"/>
           <w:kern w:val="0"/>
-          <w:sz w:val="22"/>
-          <w:szCs w:val="22"/>
           <w14:ligatures w14:val="none"/>
         </w:rPr>
         <w:t>—to achieve high predictive accuracy.</w:t>
@@ -1780,8 +1624,6 @@
           <w:rFonts w:ascii="Calibri" w:eastAsia="MS Mincho" w:hAnsi="Calibri" w:cs="Calibri"/>
           <w:color w:val="333333"/>
           <w:kern w:val="0"/>
-          <w:sz w:val="22"/>
-          <w:szCs w:val="22"/>
           <w14:ligatures w14:val="none"/>
         </w:rPr>
       </w:pPr>
@@ -1791,8 +1633,6 @@
           <w:b/>
           <w:color w:val="333333"/>
           <w:kern w:val="0"/>
-          <w:sz w:val="22"/>
-          <w:szCs w:val="22"/>
           <w14:ligatures w14:val="none"/>
         </w:rPr>
         <w:t xml:space="preserve">Operational Deployment: </w:t>
@@ -1802,8 +1642,6 @@
           <w:rFonts w:ascii="Calibri" w:eastAsia="MS Mincho" w:hAnsi="Calibri" w:cs="Calibri"/>
           <w:color w:val="333333"/>
           <w:kern w:val="0"/>
-          <w:sz w:val="22"/>
-          <w:szCs w:val="22"/>
           <w14:ligatures w14:val="none"/>
         </w:rPr>
         <w:t>To design an interactive OHS Safety Dashboard that turns complex mathematical outputs into clear risk indicators, helping safety engineers quickly support vulnerable departments.</w:t>
@@ -1817,8 +1655,6 @@
           <w:b/>
           <w:bCs/>
           <w:kern w:val="0"/>
-          <w:sz w:val="28"/>
-          <w:szCs w:val="28"/>
           <w:lang w:val="en-IE" w:eastAsia="en-GB"/>
           <w14:ligatures w14:val="none"/>
         </w:rPr>
@@ -1834,8 +1670,6 @@
           <w:rFonts w:ascii="Calibri" w:eastAsia="Calibri" w:hAnsi="Calibri" w:cs="Calibri"/>
           <w:b/>
           <w:kern w:val="0"/>
-          <w:sz w:val="28"/>
-          <w:szCs w:val="28"/>
           <w:lang w:val="en-IE" w:eastAsia="en-IE"/>
           <w14:ligatures w14:val="none"/>
         </w:rPr>
@@ -1845,8 +1679,6 @@
           <w:rFonts w:ascii="Calibri" w:eastAsia="Calibri" w:hAnsi="Calibri" w:cs="Calibri"/>
           <w:b/>
           <w:kern w:val="0"/>
-          <w:sz w:val="28"/>
-          <w:szCs w:val="28"/>
           <w:lang w:val="en-IE" w:eastAsia="en-IE"/>
           <w14:ligatures w14:val="none"/>
         </w:rPr>
@@ -1949,8 +1781,6 @@
           <w:rFonts w:ascii="Calibri" w:eastAsia="Calibri" w:hAnsi="Calibri" w:cs="Calibri"/>
           <w:b/>
           <w:kern w:val="0"/>
-          <w:sz w:val="28"/>
-          <w:szCs w:val="28"/>
           <w:lang w:val="en-IE" w:eastAsia="en-IE"/>
           <w14:ligatures w14:val="none"/>
         </w:rPr>
@@ -1960,8 +1790,6 @@
           <w:rFonts w:ascii="Calibri" w:eastAsia="Calibri" w:hAnsi="Calibri" w:cs="Calibri"/>
           <w:b/>
           <w:kern w:val="0"/>
-          <w:sz w:val="28"/>
-          <w:szCs w:val="28"/>
           <w:lang w:val="en-IE" w:eastAsia="en-IE"/>
           <w14:ligatures w14:val="none"/>
         </w:rPr>
@@ -1975,8 +1803,6 @@
           <w:rFonts w:ascii="Calibri" w:eastAsia="MS Mincho" w:hAnsi="Calibri" w:cs="Calibri"/>
           <w:color w:val="333333"/>
           <w:kern w:val="0"/>
-          <w:sz w:val="22"/>
-          <w:szCs w:val="22"/>
           <w14:ligatures w14:val="none"/>
         </w:rPr>
       </w:pPr>
@@ -1985,8 +1811,6 @@
           <w:rFonts w:ascii="Calibri" w:eastAsia="MS Mincho" w:hAnsi="Calibri" w:cs="Calibri"/>
           <w:color w:val="333333"/>
           <w:kern w:val="0"/>
-          <w:sz w:val="22"/>
-          <w:szCs w:val="22"/>
           <w14:ligatures w14:val="none"/>
         </w:rPr>
         <w:t xml:space="preserve">This project follows the industry-standard CRISP-DM (Cross-Industry Standard Process for Data Mining) framework, moving through six iterative phases: Business Understanding, Data Understanding, Data Preparation, Modeling, Evaluation, and Deployment. The technical pipeline is built entirely in Python, utilizing libraries such as Pandas, NumPy, Scikit-Learn, and </w:t>
@@ -1997,8 +1821,6 @@
           <w:rFonts w:ascii="Calibri" w:eastAsia="MS Mincho" w:hAnsi="Calibri" w:cs="Calibri"/>
           <w:color w:val="333333"/>
           <w:kern w:val="0"/>
-          <w:sz w:val="22"/>
-          <w:szCs w:val="22"/>
           <w14:ligatures w14:val="none"/>
         </w:rPr>
         <w:t>XGBoost</w:t>
@@ -2009,8 +1831,6 @@
           <w:rFonts w:ascii="Calibri" w:eastAsia="MS Mincho" w:hAnsi="Calibri" w:cs="Calibri"/>
           <w:color w:val="333333"/>
           <w:kern w:val="0"/>
-          <w:sz w:val="22"/>
-          <w:szCs w:val="22"/>
           <w14:ligatures w14:val="none"/>
         </w:rPr>
         <w:t>.</w:t>
@@ -2023,8 +1843,6 @@
           <w:rFonts w:ascii="Calibri" w:eastAsia="MS Mincho" w:hAnsi="Calibri" w:cs="Calibri"/>
           <w:color w:val="333333"/>
           <w:kern w:val="0"/>
-          <w:sz w:val="22"/>
-          <w:szCs w:val="22"/>
           <w14:ligatures w14:val="none"/>
         </w:rPr>
       </w:pPr>
@@ -2033,8 +1851,6 @@
           <w:rFonts w:ascii="Calibri" w:eastAsia="MS Mincho" w:hAnsi="Calibri" w:cs="Calibri"/>
           <w:color w:val="333333"/>
           <w:kern w:val="0"/>
-          <w:sz w:val="22"/>
-          <w:szCs w:val="22"/>
           <w14:ligatures w14:val="none"/>
         </w:rPr>
         <w:t xml:space="preserve">[Data Pipeline Workflow: Raw Employee Data Source (CSV) -&gt; Preprocessing &amp; Cleaning Pipeline -&gt; Feature Engineering &amp; Balancing (SMOTE) -&gt; Model Training (Random Forest / </w:t>
@@ -2045,8 +1861,6 @@
           <w:rFonts w:ascii="Calibri" w:eastAsia="MS Mincho" w:hAnsi="Calibri" w:cs="Calibri"/>
           <w:color w:val="333333"/>
           <w:kern w:val="0"/>
-          <w:sz w:val="22"/>
-          <w:szCs w:val="22"/>
           <w14:ligatures w14:val="none"/>
         </w:rPr>
         <w:t>LightGBM</w:t>
@@ -2057,8 +1871,6 @@
           <w:rFonts w:ascii="Calibri" w:eastAsia="MS Mincho" w:hAnsi="Calibri" w:cs="Calibri"/>
           <w:color w:val="333333"/>
           <w:kern w:val="0"/>
-          <w:sz w:val="22"/>
-          <w:szCs w:val="22"/>
           <w14:ligatures w14:val="none"/>
         </w:rPr>
         <w:t>) -&gt; Performance Evaluation (ROC-AUC) -&gt; Interactive OHS Dashboard Implementation]</w:t>
@@ -2071,8 +1883,6 @@
           <w:rFonts w:ascii="Calibri" w:eastAsia="MS Mincho" w:hAnsi="Calibri" w:cs="Calibri"/>
           <w:color w:val="333333"/>
           <w:kern w:val="0"/>
-          <w:sz w:val="22"/>
-          <w:szCs w:val="22"/>
           <w14:ligatures w14:val="none"/>
         </w:rPr>
       </w:pPr>
@@ -2082,8 +1892,6 @@
           <w:noProof/>
           <w:color w:val="333333"/>
           <w:kern w:val="0"/>
-          <w:sz w:val="22"/>
-          <w:szCs w:val="22"/>
         </w:rPr>
         <w:lastRenderedPageBreak/>
         <w:drawing>
@@ -2136,8 +1944,6 @@
           <w:rFonts w:ascii="Calibri" w:eastAsia="MS Mincho" w:hAnsi="Calibri" w:cs="Calibri"/>
           <w:color w:val="333333"/>
           <w:kern w:val="0"/>
-          <w:sz w:val="22"/>
-          <w:szCs w:val="22"/>
           <w14:ligatures w14:val="none"/>
         </w:rPr>
       </w:pPr>
@@ -2152,8 +1958,6 @@
           <w:rFonts w:ascii="Calibri" w:eastAsia="Calibri" w:hAnsi="Calibri" w:cs="Calibri"/>
           <w:b/>
           <w:kern w:val="0"/>
-          <w:sz w:val="28"/>
-          <w:szCs w:val="28"/>
           <w:lang w:val="en-IE" w:eastAsia="en-IE"/>
           <w14:ligatures w14:val="none"/>
         </w:rPr>
@@ -2163,8 +1967,6 @@
           <w:rFonts w:ascii="Calibri" w:eastAsia="Calibri" w:hAnsi="Calibri" w:cs="Calibri"/>
           <w:b/>
           <w:kern w:val="0"/>
-          <w:sz w:val="28"/>
-          <w:szCs w:val="28"/>
           <w:lang w:val="en-IE" w:eastAsia="en-IE"/>
           <w14:ligatures w14:val="none"/>
         </w:rPr>
@@ -2308,8 +2110,6 @@
           <w:rFonts w:ascii="Calibri" w:eastAsia="Calibri" w:hAnsi="Calibri" w:cs="Calibri"/>
           <w:b/>
           <w:kern w:val="0"/>
-          <w:sz w:val="28"/>
-          <w:szCs w:val="28"/>
           <w:lang w:val="en-IE" w:eastAsia="en-IE"/>
           <w14:ligatures w14:val="none"/>
         </w:rPr>
@@ -2319,8 +2119,6 @@
           <w:rFonts w:ascii="Calibri" w:eastAsia="Calibri" w:hAnsi="Calibri" w:cs="Calibri"/>
           <w:b/>
           <w:kern w:val="0"/>
-          <w:sz w:val="28"/>
-          <w:szCs w:val="28"/>
           <w:lang w:val="en-IE" w:eastAsia="en-IE"/>
           <w14:ligatures w14:val="none"/>
         </w:rPr>
@@ -2330,32 +2128,72 @@
     <w:p>
       <w:pPr>
         <w:pStyle w:val="ListBullet"/>
-      </w:pPr>
-      <w:r>
+        <w:rPr>
+          <w:rFonts w:cs="Calibri"/>
+          <w:sz w:val="24"/>
+          <w:szCs w:val="24"/>
+        </w:rPr>
+      </w:pPr>
+      <w:r>
+        <w:rPr>
+          <w:rFonts w:cs="Calibri"/>
+          <w:sz w:val="24"/>
+          <w:szCs w:val="24"/>
+        </w:rPr>
         <w:t>Technical Pipeline: A fully documented, modular Python codebase containing the end-to-end data processing, feature engineering, and trained model weights stored as serialized files.</w:t>
       </w:r>
     </w:p>
     <w:p>
       <w:pPr>
         <w:pStyle w:val="ListBullet"/>
-      </w:pPr>
-      <w:r>
+        <w:rPr>
+          <w:rFonts w:cs="Calibri"/>
+          <w:sz w:val="24"/>
+          <w:szCs w:val="24"/>
+        </w:rPr>
+      </w:pPr>
+      <w:r>
+        <w:rPr>
+          <w:rFonts w:cs="Calibri"/>
+          <w:sz w:val="24"/>
+          <w:szCs w:val="24"/>
+        </w:rPr>
         <w:t>Predictive Model: A fine-tuned machine learning classifier capable of digesting fresh employee data and outputting a categorical risk level (High Burnout Risk vs. Low Burnout Risk).</w:t>
       </w:r>
     </w:p>
     <w:p>
       <w:pPr>
         <w:pStyle w:val="ListBullet"/>
-      </w:pPr>
-      <w:r>
+        <w:rPr>
+          <w:rFonts w:cs="Calibri"/>
+          <w:sz w:val="24"/>
+          <w:szCs w:val="24"/>
+        </w:rPr>
+      </w:pPr>
+      <w:r>
+        <w:rPr>
+          <w:rFonts w:cs="Calibri"/>
+          <w:sz w:val="24"/>
+          <w:szCs w:val="24"/>
+        </w:rPr>
         <w:t xml:space="preserve">OHS Enterprise Dashboard: A functional dashboard application built using Tableau or </w:t>
       </w:r>
       <w:proofErr w:type="spellStart"/>
       <w:r>
+        <w:rPr>
+          <w:rFonts w:cs="Calibri"/>
+          <w:sz w:val="24"/>
+          <w:szCs w:val="24"/>
+        </w:rPr>
         <w:t>Streamlit</w:t>
       </w:r>
       <w:proofErr w:type="spellEnd"/>
       <w:r>
+        <w:rPr>
+          <w:rFonts w:cs="Calibri"/>
+          <w:sz w:val="24"/>
+          <w:szCs w:val="24"/>
+        </w:rPr>
         <w:t>. This interface will display predictive charts, aggregate departmental fatigue metrics, and trigger automated visual alerts for departments exceeding safety limits.</w:t>
       </w:r>
     </w:p>
@@ -2369,8 +2207,6 @@
           <w:rFonts w:ascii="Calibri" w:eastAsia="Calibri" w:hAnsi="Calibri" w:cs="Calibri"/>
           <w:b/>
           <w:kern w:val="0"/>
-          <w:sz w:val="28"/>
-          <w:szCs w:val="28"/>
           <w:lang w:val="en-IE" w:eastAsia="en-IE"/>
           <w14:ligatures w14:val="none"/>
         </w:rPr>
@@ -2380,8 +2216,6 @@
           <w:rFonts w:ascii="Calibri" w:eastAsia="Calibri" w:hAnsi="Calibri" w:cs="Calibri"/>
           <w:b/>
           <w:kern w:val="0"/>
-          <w:sz w:val="28"/>
-          <w:szCs w:val="28"/>
           <w:lang w:val="en-IE" w:eastAsia="en-IE"/>
           <w14:ligatures w14:val="none"/>
         </w:rPr>
@@ -2395,11 +2229,10 @@
         <w:tblLook w:val="04A0" w:firstRow="1" w:lastRow="0" w:firstColumn="1" w:lastColumn="0" w:noHBand="0" w:noVBand="1"/>
       </w:tblPr>
       <w:tblGrid>
-        <w:gridCol w:w="1453"/>
-        <w:gridCol w:w="1246"/>
-        <w:gridCol w:w="2158"/>
-        <w:gridCol w:w="2392"/>
-        <w:gridCol w:w="2101"/>
+        <w:gridCol w:w="1512"/>
+        <w:gridCol w:w="2570"/>
+        <w:gridCol w:w="2879"/>
+        <w:gridCol w:w="2389"/>
       </w:tblGrid>
       <w:tr>
         <w:trPr>
@@ -2409,14 +2242,24 @@
         <w:tc>
           <w:tcPr>
             <w:cnfStyle w:val="001000000000" w:firstRow="0" w:lastRow="0" w:firstColumn="1" w:lastColumn="0" w:oddVBand="0" w:evenVBand="0" w:oddHBand="0" w:evenHBand="0" w:firstRowFirstColumn="0" w:firstRowLastColumn="0" w:lastRowFirstColumn="0" w:lastRowLastColumn="0"/>
-            <w:tcW w:w="0" w:type="auto"/>
+            <w:tcW w:w="1453" w:type="dxa"/>
             <w:hideMark/>
           </w:tcPr>
           <w:p>
             <w:pPr>
               <w:pStyle w:val="ListBullet"/>
+              <w:rPr>
+                <w:rFonts w:cs="Calibri"/>
+                <w:sz w:val="24"/>
+                <w:szCs w:val="24"/>
+              </w:rPr>
             </w:pPr>
             <w:r>
+              <w:rPr>
+                <w:rFonts w:cs="Calibri"/>
+                <w:sz w:val="24"/>
+                <w:szCs w:val="24"/>
+              </w:rPr>
               <w:t>Semester</w:t>
             </w:r>
           </w:p>
@@ -2430,23 +2273,18 @@
             <w:pPr>
               <w:pStyle w:val="ListBullet"/>
               <w:cnfStyle w:val="100000000000" w:firstRow="1" w:lastRow="0" w:firstColumn="0" w:lastColumn="0" w:oddVBand="0" w:evenVBand="0" w:oddHBand="0" w:evenHBand="0" w:firstRowFirstColumn="0" w:firstRowLastColumn="0" w:lastRowFirstColumn="0" w:lastRowLastColumn="0"/>
+              <w:rPr>
+                <w:rFonts w:cs="Calibri"/>
+                <w:sz w:val="24"/>
+                <w:szCs w:val="24"/>
+              </w:rPr>
             </w:pPr>
             <w:r>
-              <w:t>Weeks</w:t>
-            </w:r>
-          </w:p>
-        </w:tc>
-        <w:tc>
-          <w:tcPr>
-            <w:tcW w:w="0" w:type="auto"/>
-            <w:hideMark/>
-          </w:tcPr>
-          <w:p>
-            <w:pPr>
-              <w:pStyle w:val="ListBullet"/>
-              <w:cnfStyle w:val="100000000000" w:firstRow="1" w:lastRow="0" w:firstColumn="0" w:lastColumn="0" w:oddVBand="0" w:evenVBand="0" w:oddHBand="0" w:evenHBand="0" w:firstRowFirstColumn="0" w:firstRowLastColumn="0" w:lastRowFirstColumn="0" w:lastRowLastColumn="0"/>
-            </w:pPr>
-            <w:r>
+              <w:rPr>
+                <w:rFonts w:cs="Calibri"/>
+                <w:sz w:val="24"/>
+                <w:szCs w:val="24"/>
+              </w:rPr>
               <w:t>Phase</w:t>
             </w:r>
           </w:p>
@@ -2460,8 +2298,18 @@
             <w:pPr>
               <w:pStyle w:val="ListBullet"/>
               <w:cnfStyle w:val="100000000000" w:firstRow="1" w:lastRow="0" w:firstColumn="0" w:lastColumn="0" w:oddVBand="0" w:evenVBand="0" w:oddHBand="0" w:evenHBand="0" w:firstRowFirstColumn="0" w:firstRowLastColumn="0" w:lastRowFirstColumn="0" w:lastRowLastColumn="0"/>
+              <w:rPr>
+                <w:rFonts w:cs="Calibri"/>
+                <w:sz w:val="24"/>
+                <w:szCs w:val="24"/>
+              </w:rPr>
             </w:pPr>
             <w:r>
+              <w:rPr>
+                <w:rFonts w:cs="Calibri"/>
+                <w:sz w:val="24"/>
+                <w:szCs w:val="24"/>
+              </w:rPr>
               <w:t>Tasks</w:t>
             </w:r>
           </w:p>
@@ -2475,8 +2323,18 @@
             <w:pPr>
               <w:pStyle w:val="ListBullet"/>
               <w:cnfStyle w:val="100000000000" w:firstRow="1" w:lastRow="0" w:firstColumn="0" w:lastColumn="0" w:oddVBand="0" w:evenVBand="0" w:oddHBand="0" w:evenHBand="0" w:firstRowFirstColumn="0" w:firstRowLastColumn="0" w:lastRowFirstColumn="0" w:lastRowLastColumn="0"/>
+              <w:rPr>
+                <w:rFonts w:cs="Calibri"/>
+                <w:sz w:val="24"/>
+                <w:szCs w:val="24"/>
+              </w:rPr>
             </w:pPr>
             <w:r>
+              <w:rPr>
+                <w:rFonts w:cs="Calibri"/>
+                <w:sz w:val="24"/>
+                <w:szCs w:val="24"/>
+              </w:rPr>
               <w:t>Milestone / Output</w:t>
             </w:r>
           </w:p>
@@ -2489,15 +2347,46 @@
         <w:tc>
           <w:tcPr>
             <w:cnfStyle w:val="001000000000" w:firstRow="0" w:lastRow="0" w:firstColumn="1" w:lastColumn="0" w:oddVBand="0" w:evenVBand="0" w:oddHBand="0" w:evenHBand="0" w:firstRowFirstColumn="0" w:firstRowLastColumn="0" w:lastRowFirstColumn="0" w:lastRowLastColumn="0"/>
-            <w:tcW w:w="0" w:type="auto"/>
+            <w:tcW w:w="1453" w:type="dxa"/>
             <w:hideMark/>
           </w:tcPr>
           <w:p>
             <w:pPr>
               <w:pStyle w:val="ListBullet"/>
+              <w:numPr>
+                <w:ilvl w:val="0"/>
+                <w:numId w:val="0"/>
+              </w:numPr>
+              <w:ind w:left="360" w:hanging="360"/>
+              <w:rPr>
+                <w:rFonts w:cs="Calibri"/>
+                <w:sz w:val="24"/>
+                <w:szCs w:val="24"/>
+              </w:rPr>
             </w:pPr>
             <w:r>
-              <w:t>Semester 1</w:t>
+              <w:rPr>
+                <w:rFonts w:cs="Calibri"/>
+                <w:sz w:val="24"/>
+                <w:szCs w:val="24"/>
+              </w:rPr>
+              <w:t>Semester</w:t>
+            </w:r>
+            <w:r>
+              <w:rPr>
+                <w:rFonts w:cs="Calibri"/>
+                <w:sz w:val="24"/>
+                <w:szCs w:val="24"/>
+              </w:rPr>
+              <w:t xml:space="preserve">    </w:t>
+            </w:r>
+            <w:r>
+              <w:rPr>
+                <w:rFonts w:cs="Calibri"/>
+                <w:sz w:val="24"/>
+                <w:szCs w:val="24"/>
+              </w:rPr>
+              <w:t xml:space="preserve"> 1</w:t>
             </w:r>
           </w:p>
         </w:tc>
@@ -2509,31 +2398,34 @@
           <w:p>
             <w:pPr>
               <w:pStyle w:val="ListBullet"/>
+              <w:numPr>
+                <w:ilvl w:val="0"/>
+                <w:numId w:val="0"/>
+              </w:numPr>
+              <w:ind w:left="360" w:hanging="360"/>
               <w:cnfStyle w:val="000000100000" w:firstRow="0" w:lastRow="0" w:firstColumn="0" w:lastColumn="0" w:oddVBand="0" w:evenVBand="0" w:oddHBand="1" w:evenHBand="0" w:firstRowFirstColumn="0" w:firstRowLastColumn="0" w:lastRowFirstColumn="0" w:lastRowLastColumn="0"/>
+              <w:rPr>
+                <w:rFonts w:cs="Calibri"/>
+                <w:sz w:val="24"/>
+                <w:szCs w:val="24"/>
+              </w:rPr>
             </w:pPr>
             <w:r>
-              <w:t>Weeks 1–6</w:t>
-            </w:r>
-          </w:p>
-        </w:tc>
-        <w:tc>
-          <w:tcPr>
-            <w:tcW w:w="0" w:type="auto"/>
-            <w:hideMark/>
-          </w:tcPr>
-          <w:p>
-            <w:pPr>
-              <w:pStyle w:val="ListBullet"/>
-              <w:cnfStyle w:val="000000100000" w:firstRow="0" w:lastRow="0" w:firstColumn="0" w:lastColumn="0" w:oddVBand="0" w:evenVBand="0" w:oddHBand="1" w:evenHBand="0" w:firstRowFirstColumn="0" w:firstRowLastColumn="0" w:lastRowFirstColumn="0" w:lastRowLastColumn="0"/>
-            </w:pPr>
-            <w:r>
-              <w:rPr>
+              <w:rPr>
+                <w:rFonts w:cs="Calibri"/>
                 <w:b/>
                 <w:bCs/>
+                <w:sz w:val="24"/>
+                <w:szCs w:val="24"/>
               </w:rPr>
               <w:t>Phase 1:</w:t>
             </w:r>
             <w:r>
+              <w:rPr>
+                <w:rFonts w:cs="Calibri"/>
+                <w:sz w:val="24"/>
+                <w:szCs w:val="24"/>
+              </w:rPr>
               <w:t xml:space="preserve"> Project Initiation &amp; Data Preparation</w:t>
             </w:r>
           </w:p>
@@ -2552,8 +2444,18 @@
               </w:numPr>
               <w:ind w:left="360"/>
               <w:cnfStyle w:val="000000100000" w:firstRow="0" w:lastRow="0" w:firstColumn="0" w:lastColumn="0" w:oddVBand="0" w:evenVBand="0" w:oddHBand="1" w:evenHBand="0" w:firstRowFirstColumn="0" w:firstRowLastColumn="0" w:lastRowFirstColumn="0" w:lastRowLastColumn="0"/>
+              <w:rPr>
+                <w:rFonts w:cs="Calibri"/>
+                <w:sz w:val="24"/>
+                <w:szCs w:val="24"/>
+              </w:rPr>
             </w:pPr>
             <w:r>
+              <w:rPr>
+                <w:rFonts w:cs="Calibri"/>
+                <w:sz w:val="24"/>
+                <w:szCs w:val="24"/>
+              </w:rPr>
               <w:t>• Solidifying business requirements</w:t>
             </w:r>
           </w:p>
@@ -2566,8 +2468,18 @@
               </w:numPr>
               <w:ind w:left="360"/>
               <w:cnfStyle w:val="000000100000" w:firstRow="0" w:lastRow="0" w:firstColumn="0" w:lastColumn="0" w:oddVBand="0" w:evenVBand="0" w:oddHBand="1" w:evenHBand="0" w:firstRowFirstColumn="0" w:firstRowLastColumn="0" w:lastRowFirstColumn="0" w:lastRowLastColumn="0"/>
+              <w:rPr>
+                <w:rFonts w:cs="Calibri"/>
+                <w:sz w:val="24"/>
+                <w:szCs w:val="24"/>
+              </w:rPr>
             </w:pPr>
             <w:r>
+              <w:rPr>
+                <w:rFonts w:cs="Calibri"/>
+                <w:sz w:val="24"/>
+                <w:szCs w:val="24"/>
+              </w:rPr>
               <w:t>• Repository establishment on GitHub</w:t>
             </w:r>
           </w:p>
@@ -2580,8 +2492,18 @@
               </w:numPr>
               <w:ind w:left="360"/>
               <w:cnfStyle w:val="000000100000" w:firstRow="0" w:lastRow="0" w:firstColumn="0" w:lastColumn="0" w:oddVBand="0" w:evenVBand="0" w:oddHBand="1" w:evenHBand="0" w:firstRowFirstColumn="0" w:firstRowLastColumn="0" w:lastRowFirstColumn="0" w:lastRowLastColumn="0"/>
+              <w:rPr>
+                <w:rFonts w:cs="Calibri"/>
+                <w:sz w:val="24"/>
+                <w:szCs w:val="24"/>
+              </w:rPr>
             </w:pPr>
             <w:r>
+              <w:rPr>
+                <w:rFonts w:cs="Calibri"/>
+                <w:sz w:val="24"/>
+                <w:szCs w:val="24"/>
+              </w:rPr>
               <w:t>• Data pipeline formulation</w:t>
             </w:r>
           </w:p>
@@ -2594,9 +2516,23 @@
           <w:p>
             <w:pPr>
               <w:pStyle w:val="ListBullet"/>
+              <w:numPr>
+                <w:ilvl w:val="0"/>
+                <w:numId w:val="0"/>
+              </w:numPr>
               <w:cnfStyle w:val="000000100000" w:firstRow="0" w:lastRow="0" w:firstColumn="0" w:lastColumn="0" w:oddVBand="0" w:evenVBand="0" w:oddHBand="1" w:evenHBand="0" w:firstRowFirstColumn="0" w:firstRowLastColumn="0" w:lastRowFirstColumn="0" w:lastRowLastColumn="0"/>
+              <w:rPr>
+                <w:rFonts w:cs="Calibri"/>
+                <w:sz w:val="24"/>
+                <w:szCs w:val="24"/>
+              </w:rPr>
             </w:pPr>
             <w:r>
+              <w:rPr>
+                <w:rFonts w:cs="Calibri"/>
+                <w:sz w:val="24"/>
+                <w:szCs w:val="24"/>
+              </w:rPr>
               <w:t>Project initiation and setup</w:t>
             </w:r>
           </w:p>
@@ -2606,12 +2542,22 @@
         <w:tc>
           <w:tcPr>
             <w:cnfStyle w:val="001000000000" w:firstRow="0" w:lastRow="0" w:firstColumn="1" w:lastColumn="0" w:oddVBand="0" w:evenVBand="0" w:oddHBand="0" w:evenHBand="0" w:firstRowFirstColumn="0" w:firstRowLastColumn="0" w:lastRowFirstColumn="0" w:lastRowLastColumn="0"/>
-            <w:tcW w:w="0" w:type="auto"/>
+            <w:tcW w:w="1453" w:type="dxa"/>
             <w:hideMark/>
           </w:tcPr>
           <w:p>
             <w:pPr>
               <w:pStyle w:val="ListBullet"/>
+              <w:numPr>
+                <w:ilvl w:val="0"/>
+                <w:numId w:val="0"/>
+              </w:numPr>
+              <w:ind w:left="360"/>
+              <w:rPr>
+                <w:rFonts w:cs="Calibri"/>
+                <w:sz w:val="24"/>
+                <w:szCs w:val="24"/>
+              </w:rPr>
             </w:pPr>
           </w:p>
         </w:tc>
@@ -2623,53 +2569,34 @@
           <w:p>
             <w:pPr>
               <w:pStyle w:val="ListBullet"/>
-              <w:cnfStyle w:val="000000000000" w:firstRow="0" w:lastRow="0" w:firstColumn="0" w:lastColumn="0" w:oddVBand="0" w:evenVBand="0" w:oddHBand="0" w:evenHBand="0" w:firstRowFirstColumn="0" w:firstRowLastColumn="0" w:lastRowFirstColumn="0" w:lastRowLastColumn="0"/>
-            </w:pPr>
-            <w:r>
-              <w:t>Weeks 7–12</w:t>
-            </w:r>
-          </w:p>
-          <w:p>
-            <w:pPr>
-              <w:pStyle w:val="ListBullet"/>
               <w:numPr>
                 <w:ilvl w:val="0"/>
                 <w:numId w:val="0"/>
               </w:numPr>
-              <w:ind w:left="360"/>
+              <w:ind w:left="360" w:hanging="360"/>
               <w:cnfStyle w:val="000000000000" w:firstRow="0" w:lastRow="0" w:firstColumn="0" w:lastColumn="0" w:oddVBand="0" w:evenVBand="0" w:oddHBand="0" w:evenHBand="0" w:firstRowFirstColumn="0" w:firstRowLastColumn="0" w:lastRowFirstColumn="0" w:lastRowLastColumn="0"/>
-            </w:pPr>
-          </w:p>
-          <w:p>
-            <w:pPr>
-              <w:pStyle w:val="ListBullet"/>
-              <w:numPr>
-                <w:ilvl w:val="0"/>
-                <w:numId w:val="0"/>
-              </w:numPr>
-              <w:ind w:left="360"/>
-              <w:cnfStyle w:val="000000000000" w:firstRow="0" w:lastRow="0" w:firstColumn="0" w:lastColumn="0" w:oddVBand="0" w:evenVBand="0" w:oddHBand="0" w:evenHBand="0" w:firstRowFirstColumn="0" w:firstRowLastColumn="0" w:lastRowFirstColumn="0" w:lastRowLastColumn="0"/>
-            </w:pPr>
-          </w:p>
-        </w:tc>
-        <w:tc>
-          <w:tcPr>
-            <w:tcW w:w="0" w:type="auto"/>
-            <w:hideMark/>
-          </w:tcPr>
-          <w:p>
-            <w:pPr>
-              <w:pStyle w:val="ListBullet"/>
-              <w:cnfStyle w:val="000000000000" w:firstRow="0" w:lastRow="0" w:firstColumn="0" w:lastColumn="0" w:oddVBand="0" w:evenVBand="0" w:oddHBand="0" w:evenHBand="0" w:firstRowFirstColumn="0" w:firstRowLastColumn="0" w:lastRowFirstColumn="0" w:lastRowLastColumn="0"/>
+              <w:rPr>
+                <w:rFonts w:cs="Calibri"/>
+                <w:sz w:val="24"/>
+                <w:szCs w:val="24"/>
+              </w:rPr>
             </w:pPr>
             <w:r>
               <w:rPr>
+                <w:rFonts w:cs="Calibri"/>
                 <w:b/>
                 <w:bCs/>
+                <w:sz w:val="24"/>
+                <w:szCs w:val="24"/>
               </w:rPr>
               <w:t>Phase 2:</w:t>
             </w:r>
             <w:r>
+              <w:rPr>
+                <w:rFonts w:cs="Calibri"/>
+                <w:sz w:val="24"/>
+                <w:szCs w:val="24"/>
+              </w:rPr>
               <w:t xml:space="preserve"> Exploratory Data Analysis &amp; Modeling</w:t>
             </w:r>
           </w:p>
@@ -2688,8 +2615,18 @@
               </w:numPr>
               <w:ind w:left="360"/>
               <w:cnfStyle w:val="000000000000" w:firstRow="0" w:lastRow="0" w:firstColumn="0" w:lastColumn="0" w:oddVBand="0" w:evenVBand="0" w:oddHBand="0" w:evenHBand="0" w:firstRowFirstColumn="0" w:firstRowLastColumn="0" w:lastRowFirstColumn="0" w:lastRowLastColumn="0"/>
+              <w:rPr>
+                <w:rFonts w:cs="Calibri"/>
+                <w:sz w:val="24"/>
+                <w:szCs w:val="24"/>
+              </w:rPr>
             </w:pPr>
             <w:r>
+              <w:rPr>
+                <w:rFonts w:cs="Calibri"/>
+                <w:sz w:val="24"/>
+                <w:szCs w:val="24"/>
+              </w:rPr>
               <w:t>• Detailed execution of feature correlation</w:t>
             </w:r>
           </w:p>
@@ -2702,8 +2639,18 @@
               </w:numPr>
               <w:ind w:left="360"/>
               <w:cnfStyle w:val="000000000000" w:firstRow="0" w:lastRow="0" w:firstColumn="0" w:lastColumn="0" w:oddVBand="0" w:evenVBand="0" w:oddHBand="0" w:evenHBand="0" w:firstRowFirstColumn="0" w:firstRowLastColumn="0" w:lastRowFirstColumn="0" w:lastRowLastColumn="0"/>
+              <w:rPr>
+                <w:rFonts w:cs="Calibri"/>
+                <w:sz w:val="24"/>
+                <w:szCs w:val="24"/>
+              </w:rPr>
             </w:pPr>
             <w:r>
+              <w:rPr>
+                <w:rFonts w:cs="Calibri"/>
+                <w:sz w:val="24"/>
+                <w:szCs w:val="24"/>
+              </w:rPr>
               <w:t>• Preliminary model exploration</w:t>
             </w:r>
           </w:p>
@@ -2716,12 +2663,25 @@
           <w:p>
             <w:pPr>
               <w:pStyle w:val="ListBullet"/>
+              <w:numPr>
+                <w:ilvl w:val="0"/>
+                <w:numId w:val="0"/>
+              </w:numPr>
+              <w:ind w:left="360" w:hanging="360"/>
               <w:cnfStyle w:val="000000000000" w:firstRow="0" w:lastRow="0" w:firstColumn="0" w:lastColumn="0" w:oddVBand="0" w:evenVBand="0" w:oddHBand="0" w:evenHBand="0" w:firstRowFirstColumn="0" w:firstRowLastColumn="0" w:lastRowFirstColumn="0" w:lastRowLastColumn="0"/>
+              <w:rPr>
+                <w:rFonts w:cs="Calibri"/>
+                <w:sz w:val="24"/>
+                <w:szCs w:val="24"/>
+              </w:rPr>
             </w:pPr>
             <w:r>
               <w:rPr>
+                <w:rFonts w:cs="Calibri"/>
                 <w:b/>
                 <w:bCs/>
+                <w:sz w:val="24"/>
+                <w:szCs w:val="24"/>
               </w:rPr>
               <w:t>Milestone: CA1 Report Submission</w:t>
             </w:r>
@@ -2735,14 +2695,29 @@
         <w:tc>
           <w:tcPr>
             <w:cnfStyle w:val="001000000000" w:firstRow="0" w:lastRow="0" w:firstColumn="1" w:lastColumn="0" w:oddVBand="0" w:evenVBand="0" w:oddHBand="0" w:evenHBand="0" w:firstRowFirstColumn="0" w:firstRowLastColumn="0" w:lastRowFirstColumn="0" w:lastRowLastColumn="0"/>
-            <w:tcW w:w="0" w:type="auto"/>
+            <w:tcW w:w="1453" w:type="dxa"/>
             <w:hideMark/>
           </w:tcPr>
           <w:p>
             <w:pPr>
               <w:pStyle w:val="ListBullet"/>
+              <w:numPr>
+                <w:ilvl w:val="0"/>
+                <w:numId w:val="0"/>
+              </w:numPr>
+              <w:ind w:left="360" w:hanging="360"/>
+              <w:rPr>
+                <w:rFonts w:cs="Calibri"/>
+                <w:sz w:val="24"/>
+                <w:szCs w:val="24"/>
+              </w:rPr>
             </w:pPr>
             <w:r>
+              <w:rPr>
+                <w:rFonts w:cs="Calibri"/>
+                <w:sz w:val="24"/>
+                <w:szCs w:val="24"/>
+              </w:rPr>
               <w:lastRenderedPageBreak/>
               <w:t>Semester 2</w:t>
             </w:r>
@@ -2756,31 +2731,34 @@
           <w:p>
             <w:pPr>
               <w:pStyle w:val="ListBullet"/>
+              <w:numPr>
+                <w:ilvl w:val="0"/>
+                <w:numId w:val="0"/>
+              </w:numPr>
+              <w:ind w:left="360" w:hanging="360"/>
               <w:cnfStyle w:val="000000100000" w:firstRow="0" w:lastRow="0" w:firstColumn="0" w:lastColumn="0" w:oddVBand="0" w:evenVBand="0" w:oddHBand="1" w:evenHBand="0" w:firstRowFirstColumn="0" w:firstRowLastColumn="0" w:lastRowFirstColumn="0" w:lastRowLastColumn="0"/>
+              <w:rPr>
+                <w:rFonts w:cs="Calibri"/>
+                <w:sz w:val="24"/>
+                <w:szCs w:val="24"/>
+              </w:rPr>
             </w:pPr>
             <w:r>
-              <w:t>Weeks 1–5</w:t>
-            </w:r>
-          </w:p>
-        </w:tc>
-        <w:tc>
-          <w:tcPr>
-            <w:tcW w:w="0" w:type="auto"/>
-            <w:hideMark/>
-          </w:tcPr>
-          <w:p>
-            <w:pPr>
-              <w:pStyle w:val="ListBullet"/>
-              <w:cnfStyle w:val="000000100000" w:firstRow="0" w:lastRow="0" w:firstColumn="0" w:lastColumn="0" w:oddVBand="0" w:evenVBand="0" w:oddHBand="1" w:evenHBand="0" w:firstRowFirstColumn="0" w:firstRowLastColumn="0" w:lastRowFirstColumn="0" w:lastRowLastColumn="0"/>
-            </w:pPr>
-            <w:r>
-              <w:rPr>
+              <w:rPr>
+                <w:rFonts w:cs="Calibri"/>
                 <w:b/>
                 <w:bCs/>
+                <w:sz w:val="24"/>
+                <w:szCs w:val="24"/>
               </w:rPr>
               <w:t>Phase 3:</w:t>
             </w:r>
             <w:r>
+              <w:rPr>
+                <w:rFonts w:cs="Calibri"/>
+                <w:sz w:val="24"/>
+                <w:szCs w:val="24"/>
+              </w:rPr>
               <w:t xml:space="preserve"> Advanced Training &amp; Fine-Tuning</w:t>
             </w:r>
           </w:p>
@@ -2799,8 +2777,18 @@
               </w:numPr>
               <w:ind w:left="360"/>
               <w:cnfStyle w:val="000000100000" w:firstRow="0" w:lastRow="0" w:firstColumn="0" w:lastColumn="0" w:oddVBand="0" w:evenVBand="0" w:oddHBand="1" w:evenHBand="0" w:firstRowFirstColumn="0" w:firstRowLastColumn="0" w:lastRowFirstColumn="0" w:lastRowLastColumn="0"/>
+              <w:rPr>
+                <w:rFonts w:cs="Calibri"/>
+                <w:sz w:val="24"/>
+                <w:szCs w:val="24"/>
+              </w:rPr>
             </w:pPr>
             <w:r>
+              <w:rPr>
+                <w:rFonts w:cs="Calibri"/>
+                <w:sz w:val="24"/>
+                <w:szCs w:val="24"/>
+              </w:rPr>
               <w:t>• Hyperparameter tuning</w:t>
             </w:r>
           </w:p>
@@ -2813,8 +2801,18 @@
               </w:numPr>
               <w:ind w:left="360"/>
               <w:cnfStyle w:val="000000100000" w:firstRow="0" w:lastRow="0" w:firstColumn="0" w:lastColumn="0" w:oddVBand="0" w:evenVBand="0" w:oddHBand="1" w:evenHBand="0" w:firstRowFirstColumn="0" w:firstRowLastColumn="0" w:lastRowFirstColumn="0" w:lastRowLastColumn="0"/>
+              <w:rPr>
+                <w:rFonts w:cs="Calibri"/>
+                <w:sz w:val="24"/>
+                <w:szCs w:val="24"/>
+              </w:rPr>
             </w:pPr>
             <w:r>
+              <w:rPr>
+                <w:rFonts w:cs="Calibri"/>
+                <w:sz w:val="24"/>
+                <w:szCs w:val="24"/>
+              </w:rPr>
               <w:t>• Algorithm cross-validation</w:t>
             </w:r>
           </w:p>
@@ -2827,8 +2825,18 @@
               </w:numPr>
               <w:ind w:left="360"/>
               <w:cnfStyle w:val="000000100000" w:firstRow="0" w:lastRow="0" w:firstColumn="0" w:lastColumn="0" w:oddVBand="0" w:evenVBand="0" w:oddHBand="1" w:evenHBand="0" w:firstRowFirstColumn="0" w:firstRowLastColumn="0" w:lastRowFirstColumn="0" w:lastRowLastColumn="0"/>
+              <w:rPr>
+                <w:rFonts w:cs="Calibri"/>
+                <w:sz w:val="24"/>
+                <w:szCs w:val="24"/>
+              </w:rPr>
             </w:pPr>
             <w:r>
+              <w:rPr>
+                <w:rFonts w:cs="Calibri"/>
+                <w:sz w:val="24"/>
+                <w:szCs w:val="24"/>
+              </w:rPr>
               <w:t>• Selection of the final safety model</w:t>
             </w:r>
           </w:p>
@@ -2841,9 +2849,24 @@
           <w:p>
             <w:pPr>
               <w:pStyle w:val="ListBullet"/>
+              <w:numPr>
+                <w:ilvl w:val="0"/>
+                <w:numId w:val="0"/>
+              </w:numPr>
+              <w:ind w:left="360" w:hanging="360"/>
               <w:cnfStyle w:val="000000100000" w:firstRow="0" w:lastRow="0" w:firstColumn="0" w:lastColumn="0" w:oddVBand="0" w:evenVBand="0" w:oddHBand="1" w:evenHBand="0" w:firstRowFirstColumn="0" w:firstRowLastColumn="0" w:lastRowFirstColumn="0" w:lastRowLastColumn="0"/>
+              <w:rPr>
+                <w:rFonts w:cs="Calibri"/>
+                <w:sz w:val="24"/>
+                <w:szCs w:val="24"/>
+              </w:rPr>
             </w:pPr>
             <w:r>
+              <w:rPr>
+                <w:rFonts w:cs="Calibri"/>
+                <w:sz w:val="24"/>
+                <w:szCs w:val="24"/>
+              </w:rPr>
               <w:t>Final model selected</w:t>
             </w:r>
           </w:p>
@@ -2853,12 +2876,22 @@
         <w:tc>
           <w:tcPr>
             <w:cnfStyle w:val="001000000000" w:firstRow="0" w:lastRow="0" w:firstColumn="1" w:lastColumn="0" w:oddVBand="0" w:evenVBand="0" w:oddHBand="0" w:evenHBand="0" w:firstRowFirstColumn="0" w:firstRowLastColumn="0" w:lastRowFirstColumn="0" w:lastRowLastColumn="0"/>
-            <w:tcW w:w="0" w:type="auto"/>
+            <w:tcW w:w="1453" w:type="dxa"/>
             <w:hideMark/>
           </w:tcPr>
           <w:p>
             <w:pPr>
               <w:pStyle w:val="ListBullet"/>
+              <w:numPr>
+                <w:ilvl w:val="0"/>
+                <w:numId w:val="0"/>
+              </w:numPr>
+              <w:ind w:left="360"/>
+              <w:rPr>
+                <w:rFonts w:cs="Calibri"/>
+                <w:sz w:val="24"/>
+                <w:szCs w:val="24"/>
+              </w:rPr>
             </w:pPr>
           </w:p>
         </w:tc>
@@ -2870,31 +2903,33 @@
           <w:p>
             <w:pPr>
               <w:pStyle w:val="ListBullet"/>
+              <w:numPr>
+                <w:ilvl w:val="0"/>
+                <w:numId w:val="0"/>
+              </w:numPr>
               <w:cnfStyle w:val="000000000000" w:firstRow="0" w:lastRow="0" w:firstColumn="0" w:lastColumn="0" w:oddVBand="0" w:evenVBand="0" w:oddHBand="0" w:evenHBand="0" w:firstRowFirstColumn="0" w:firstRowLastColumn="0" w:lastRowFirstColumn="0" w:lastRowLastColumn="0"/>
+              <w:rPr>
+                <w:rFonts w:cs="Calibri"/>
+                <w:sz w:val="24"/>
+                <w:szCs w:val="24"/>
+              </w:rPr>
             </w:pPr>
             <w:r>
-              <w:t>Weeks 6–12</w:t>
-            </w:r>
-          </w:p>
-        </w:tc>
-        <w:tc>
-          <w:tcPr>
-            <w:tcW w:w="0" w:type="auto"/>
-            <w:hideMark/>
-          </w:tcPr>
-          <w:p>
-            <w:pPr>
-              <w:pStyle w:val="ListBullet"/>
-              <w:cnfStyle w:val="000000000000" w:firstRow="0" w:lastRow="0" w:firstColumn="0" w:lastColumn="0" w:oddVBand="0" w:evenVBand="0" w:oddHBand="0" w:evenHBand="0" w:firstRowFirstColumn="0" w:firstRowLastColumn="0" w:lastRowFirstColumn="0" w:lastRowLastColumn="0"/>
-            </w:pPr>
-            <w:r>
-              <w:rPr>
+              <w:rPr>
+                <w:rFonts w:cs="Calibri"/>
                 <w:b/>
                 <w:bCs/>
+                <w:sz w:val="24"/>
+                <w:szCs w:val="24"/>
               </w:rPr>
               <w:t>Phase 4:</w:t>
             </w:r>
             <w:r>
+              <w:rPr>
+                <w:rFonts w:cs="Calibri"/>
+                <w:sz w:val="24"/>
+                <w:szCs w:val="24"/>
+              </w:rPr>
               <w:t xml:space="preserve"> Dashboard Construction &amp; Project Finalization</w:t>
             </w:r>
           </w:p>
@@ -2913,8 +2948,18 @@
               </w:numPr>
               <w:ind w:left="360"/>
               <w:cnfStyle w:val="000000000000" w:firstRow="0" w:lastRow="0" w:firstColumn="0" w:lastColumn="0" w:oddVBand="0" w:evenVBand="0" w:oddHBand="0" w:evenHBand="0" w:firstRowFirstColumn="0" w:firstRowLastColumn="0" w:lastRowFirstColumn="0" w:lastRowLastColumn="0"/>
+              <w:rPr>
+                <w:rFonts w:cs="Calibri"/>
+                <w:sz w:val="24"/>
+                <w:szCs w:val="24"/>
+              </w:rPr>
             </w:pPr>
             <w:r>
+              <w:rPr>
+                <w:rFonts w:cs="Calibri"/>
+                <w:sz w:val="24"/>
+                <w:szCs w:val="24"/>
+              </w:rPr>
               <w:t>• Developing the interactive dashboard interface</w:t>
             </w:r>
           </w:p>
@@ -2927,8 +2972,18 @@
               </w:numPr>
               <w:ind w:left="360"/>
               <w:cnfStyle w:val="000000000000" w:firstRow="0" w:lastRow="0" w:firstColumn="0" w:lastColumn="0" w:oddVBand="0" w:evenVBand="0" w:oddHBand="0" w:evenHBand="0" w:firstRowFirstColumn="0" w:firstRowLastColumn="0" w:lastRowFirstColumn="0" w:lastRowLastColumn="0"/>
+              <w:rPr>
+                <w:rFonts w:cs="Calibri"/>
+                <w:sz w:val="24"/>
+                <w:szCs w:val="24"/>
+              </w:rPr>
             </w:pPr>
             <w:r>
+              <w:rPr>
+                <w:rFonts w:cs="Calibri"/>
+                <w:sz w:val="24"/>
+                <w:szCs w:val="24"/>
+              </w:rPr>
               <w:t>• Compiling the terminal capstone thesis report</w:t>
             </w:r>
           </w:p>
@@ -2941,8 +2996,18 @@
               </w:numPr>
               <w:ind w:left="360"/>
               <w:cnfStyle w:val="000000000000" w:firstRow="0" w:lastRow="0" w:firstColumn="0" w:lastColumn="0" w:oddVBand="0" w:evenVBand="0" w:oddHBand="0" w:evenHBand="0" w:firstRowFirstColumn="0" w:firstRowLastColumn="0" w:lastRowFirstColumn="0" w:lastRowLastColumn="0"/>
+              <w:rPr>
+                <w:rFonts w:cs="Calibri"/>
+                <w:sz w:val="24"/>
+                <w:szCs w:val="24"/>
+              </w:rPr>
             </w:pPr>
             <w:r>
+              <w:rPr>
+                <w:rFonts w:cs="Calibri"/>
+                <w:sz w:val="24"/>
+                <w:szCs w:val="24"/>
+              </w:rPr>
               <w:t>• Final presentation</w:t>
             </w:r>
           </w:p>
@@ -2955,12 +3020,24 @@
           <w:p>
             <w:pPr>
               <w:pStyle w:val="ListBullet"/>
+              <w:numPr>
+                <w:ilvl w:val="0"/>
+                <w:numId w:val="0"/>
+              </w:numPr>
               <w:cnfStyle w:val="000000000000" w:firstRow="0" w:lastRow="0" w:firstColumn="0" w:lastColumn="0" w:oddVBand="0" w:evenVBand="0" w:oddHBand="0" w:evenHBand="0" w:firstRowFirstColumn="0" w:firstRowLastColumn="0" w:lastRowFirstColumn="0" w:lastRowLastColumn="0"/>
+              <w:rPr>
+                <w:rFonts w:cs="Calibri"/>
+                <w:sz w:val="24"/>
+                <w:szCs w:val="24"/>
+              </w:rPr>
             </w:pPr>
             <w:r>
               <w:rPr>
+                <w:rFonts w:cs="Calibri"/>
                 <w:b/>
                 <w:bCs/>
+                <w:sz w:val="24"/>
+                <w:szCs w:val="24"/>
               </w:rPr>
               <w:t>Terminal Capstone Thesis &amp; Final Presentation</w:t>
             </w:r>
@@ -2978,8 +3055,6 @@
           <w:rFonts w:ascii="Calibri" w:eastAsia="Calibri" w:hAnsi="Calibri" w:cs="Calibri"/>
           <w:b/>
           <w:kern w:val="0"/>
-          <w:sz w:val="28"/>
-          <w:szCs w:val="28"/>
           <w:lang w:val="en-IE" w:eastAsia="en-IE"/>
           <w14:ligatures w14:val="none"/>
         </w:rPr>
@@ -2989,8 +3064,6 @@
           <w:rFonts w:ascii="Calibri" w:eastAsia="Calibri" w:hAnsi="Calibri" w:cs="Calibri"/>
           <w:b/>
           <w:kern w:val="0"/>
-          <w:sz w:val="28"/>
-          <w:szCs w:val="28"/>
           <w:lang w:val="en-IE" w:eastAsia="en-IE"/>
           <w14:ligatures w14:val="none"/>
         </w:rPr>
@@ -2999,63 +3072,70 @@
     </w:p>
     <w:p>
       <w:pPr>
-        <w:spacing w:before="100" w:beforeAutospacing="1" w:after="100" w:afterAutospacing="1" w:line="240" w:lineRule="auto"/>
-        <w:rPr>
-          <w:rFonts w:ascii="Calibri" w:eastAsia="Times New Roman" w:hAnsi="Calibri" w:cs="Calibri"/>
-          <w:kern w:val="0"/>
-          <w:lang w:val="en-IE" w:eastAsia="en-GB"/>
-          <w14:ligatures w14:val="none"/>
-        </w:rPr>
-      </w:pPr>
-      <w:r>
-        <w:rPr>
-          <w:rFonts w:ascii="Calibri" w:eastAsia="Times New Roman" w:hAnsi="Calibri" w:cs="Calibri"/>
-          <w:kern w:val="0"/>
-          <w:lang w:val="en-IE" w:eastAsia="en-GB"/>
-          <w14:ligatures w14:val="none"/>
-        </w:rPr>
-        <w:t>Identify relevant ethical, privacy, data protection, security and data-use considerations associated with the project. Explain how these will be appropriately addressed, including permissions for accessing and using the selected data.</w:t>
-      </w:r>
-    </w:p>
-    <w:p>
-      <w:pPr>
         <w:spacing w:after="0" w:line="256" w:lineRule="auto"/>
         <w:rPr>
-          <w:rFonts w:ascii="Calibri" w:eastAsia="Calibri" w:hAnsi="Calibri" w:cs="Calibri"/>
-          <w:kern w:val="0"/>
-          <w:sz w:val="22"/>
-          <w:szCs w:val="22"/>
-          <w:lang w:val="en-IE" w:eastAsia="en-IE"/>
-          <w14:ligatures w14:val="none"/>
-        </w:rPr>
-      </w:pPr>
+          <w:rFonts w:ascii="Calibri" w:eastAsia="Times New Roman" w:hAnsi="Calibri" w:cs="Calibri"/>
+          <w:kern w:val="0"/>
+          <w:lang w:eastAsia="en-GB"/>
+          <w14:ligatures w14:val="none"/>
+        </w:rPr>
+      </w:pPr>
+      <w:r>
+        <w:rPr>
+          <w:rFonts w:ascii="Calibri" w:eastAsia="Times New Roman" w:hAnsi="Calibri" w:cs="Calibri"/>
+          <w:kern w:val="0"/>
+          <w:lang w:eastAsia="en-GB"/>
+          <w14:ligatures w14:val="none"/>
+        </w:rPr>
+        <w:t>Ethical data governance is central to this OHS project. Since the dataset used in this project is entirely synthetic, it inherently contains no actual personal, sensitive, or real-world confidential employee information, thereby eliminating any data privacy breaches or compliance risks. There is absolute risk insulation regarding workplace discrimination; the project proposal contains strict legal policy text stating that model predictions are strictly for organizational health provisioning and workload adjustments, and cannot legally be used for negative performance reviews or downsizing strategies. Data encryption will be enforced across all data storage locations, including secure encryption protocols for the GitHub environment.</w:t>
+      </w:r>
     </w:p>
     <w:p>
       <w:pPr>
         <w:spacing w:after="0" w:line="256" w:lineRule="auto"/>
         <w:rPr>
-          <w:rFonts w:ascii="Calibri" w:eastAsia="Calibri" w:hAnsi="Calibri" w:cs="Calibri"/>
+          <w:rFonts w:ascii="Calibri" w:eastAsia="Times New Roman" w:hAnsi="Calibri" w:cs="Calibri"/>
           <w:b/>
           <w:bCs/>
           <w:kern w:val="0"/>
-          <w:sz w:val="22"/>
-          <w:szCs w:val="22"/>
-          <w:lang w:val="en-IE" w:eastAsia="en-IE"/>
-          <w14:ligatures w14:val="none"/>
-        </w:rPr>
-      </w:pPr>
-      <w:r>
-        <w:rPr>
-          <w:rFonts w:ascii="Calibri" w:eastAsia="Calibri" w:hAnsi="Calibri" w:cs="Calibri"/>
+          <w:lang w:eastAsia="en-GB"/>
+          <w14:ligatures w14:val="none"/>
+        </w:rPr>
+      </w:pPr>
+    </w:p>
+    <w:p>
+      <w:pPr>
+        <w:spacing w:after="0" w:line="256" w:lineRule="auto"/>
+        <w:rPr>
+          <w:rFonts w:ascii="Calibri" w:eastAsia="Times New Roman" w:hAnsi="Calibri" w:cs="Calibri"/>
           <w:b/>
           <w:bCs/>
           <w:kern w:val="0"/>
-          <w:sz w:val="22"/>
-          <w:szCs w:val="22"/>
-          <w:lang w:val="en-IE" w:eastAsia="en-IE"/>
-          <w14:ligatures w14:val="none"/>
-        </w:rPr>
-        <w:t>Sample Ideas for Capstone Projects:</w:t>
+          <w:lang w:eastAsia="en-GB"/>
+          <w14:ligatures w14:val="none"/>
+        </w:rPr>
+      </w:pPr>
+      <w:r>
+        <w:rPr>
+          <w:rFonts w:ascii="Calibri" w:eastAsia="Times New Roman" w:hAnsi="Calibri" w:cs="Calibri"/>
+          <w:b/>
+          <w:bCs/>
+          <w:kern w:val="0"/>
+          <w:lang w:eastAsia="en-GB"/>
+          <w14:ligatures w14:val="none"/>
+        </w:rPr>
+        <w:t xml:space="preserve">    </w:t>
+      </w:r>
+      <w:r>
+        <w:rPr>
+          <w:rFonts w:ascii="Calibri" w:eastAsia="Times New Roman" w:hAnsi="Calibri" w:cs="Calibri"/>
+          <w:b/>
+          <w:bCs/>
+          <w:kern w:val="0"/>
+          <w:lang w:eastAsia="en-GB"/>
+          <w14:ligatures w14:val="none"/>
+        </w:rPr>
+        <w:t>References</w:t>
       </w:r>
     </w:p>
     <w:p>
@@ -3064,203 +3144,159 @@
         <w:rPr>
           <w:rFonts w:ascii="Calibri" w:eastAsia="Calibri" w:hAnsi="Calibri" w:cs="Calibri"/>
           <w:kern w:val="0"/>
-          <w:sz w:val="22"/>
-          <w:szCs w:val="22"/>
-          <w:lang w:val="en-IE" w:eastAsia="en-IE"/>
-          <w14:ligatures w14:val="none"/>
-        </w:rPr>
-      </w:pPr>
-      <w:r>
-        <w:rPr>
-          <w:rFonts w:ascii="Calibri" w:eastAsia="Calibri" w:hAnsi="Calibri" w:cs="Calibri"/>
-          <w:kern w:val="0"/>
-          <w:sz w:val="22"/>
-          <w:szCs w:val="22"/>
-          <w:lang w:val="en-IE" w:eastAsia="en-IE"/>
-          <w14:ligatures w14:val="none"/>
-        </w:rPr>
-        <w:t>Predictive Analytics for Customer Churn in E-commerce.</w:t>
-      </w:r>
-    </w:p>
-    <w:p>
-      <w:pPr>
-        <w:spacing w:after="0" w:line="256" w:lineRule="auto"/>
-        <w:rPr>
-          <w:rFonts w:ascii="Calibri" w:eastAsia="Calibri" w:hAnsi="Calibri" w:cs="Calibri"/>
-          <w:kern w:val="0"/>
-          <w:sz w:val="22"/>
-          <w:szCs w:val="22"/>
-          <w:lang w:val="en-IE" w:eastAsia="en-IE"/>
-          <w14:ligatures w14:val="none"/>
-        </w:rPr>
-      </w:pPr>
-      <w:r>
-        <w:rPr>
-          <w:rFonts w:ascii="Calibri" w:eastAsia="Calibri" w:hAnsi="Calibri" w:cs="Calibri"/>
-          <w:kern w:val="0"/>
-          <w:sz w:val="22"/>
-          <w:szCs w:val="22"/>
-          <w:lang w:val="en-IE" w:eastAsia="en-IE"/>
-          <w14:ligatures w14:val="none"/>
-        </w:rPr>
-        <w:t>Increasing company sales</w:t>
-      </w:r>
-    </w:p>
-    <w:p>
-      <w:pPr>
-        <w:spacing w:after="0" w:line="256" w:lineRule="auto"/>
-        <w:rPr>
-          <w:rFonts w:ascii="Calibri" w:eastAsia="Calibri" w:hAnsi="Calibri" w:cs="Calibri"/>
-          <w:kern w:val="0"/>
-          <w:sz w:val="22"/>
-          <w:szCs w:val="22"/>
-          <w:lang w:val="en-IE" w:eastAsia="en-IE"/>
-          <w14:ligatures w14:val="none"/>
-        </w:rPr>
-      </w:pPr>
-      <w:r>
-        <w:rPr>
-          <w:rFonts w:ascii="Calibri" w:eastAsia="Calibri" w:hAnsi="Calibri" w:cs="Calibri"/>
-          <w:kern w:val="0"/>
-          <w:sz w:val="22"/>
-          <w:szCs w:val="22"/>
-          <w:lang w:val="en-IE" w:eastAsia="en-IE"/>
-          <w14:ligatures w14:val="none"/>
-        </w:rPr>
-        <w:t>Financial Fraud Detection (Anomaly detection)</w:t>
-      </w:r>
-    </w:p>
-    <w:p>
-      <w:pPr>
-        <w:spacing w:after="0" w:line="256" w:lineRule="auto"/>
-        <w:rPr>
-          <w:rFonts w:ascii="Calibri" w:eastAsia="Calibri" w:hAnsi="Calibri" w:cs="Calibri"/>
-          <w:kern w:val="0"/>
-          <w:sz w:val="22"/>
-          <w:szCs w:val="22"/>
-          <w:lang w:val="en-IE" w:eastAsia="en-IE"/>
-          <w14:ligatures w14:val="none"/>
-        </w:rPr>
-      </w:pPr>
-      <w:r>
-        <w:rPr>
-          <w:rFonts w:ascii="Calibri" w:eastAsia="Calibri" w:hAnsi="Calibri" w:cs="Calibri"/>
-          <w:kern w:val="0"/>
-          <w:sz w:val="22"/>
-          <w:szCs w:val="22"/>
-          <w:lang w:val="en-IE" w:eastAsia="en-IE"/>
-          <w14:ligatures w14:val="none"/>
-        </w:rPr>
-        <w:t>Personalised pricing.</w:t>
-      </w:r>
-    </w:p>
-    <w:p>
-      <w:pPr>
-        <w:spacing w:after="0" w:line="256" w:lineRule="auto"/>
-        <w:rPr>
-          <w:rFonts w:ascii="Calibri" w:eastAsia="Calibri" w:hAnsi="Calibri" w:cs="Calibri"/>
-          <w:kern w:val="0"/>
-          <w:sz w:val="22"/>
-          <w:szCs w:val="22"/>
-          <w:lang w:val="en-IE" w:eastAsia="en-IE"/>
-          <w14:ligatures w14:val="none"/>
-        </w:rPr>
-      </w:pPr>
-      <w:r>
-        <w:rPr>
-          <w:rFonts w:ascii="Calibri" w:eastAsia="Calibri" w:hAnsi="Calibri" w:cs="Calibri"/>
-          <w:kern w:val="0"/>
-          <w:sz w:val="22"/>
-          <w:szCs w:val="22"/>
-          <w:lang w:val="en-IE" w:eastAsia="en-IE"/>
-          <w14:ligatures w14:val="none"/>
-        </w:rPr>
-        <w:t>Event analysis</w:t>
-      </w:r>
-    </w:p>
-    <w:p>
-      <w:pPr>
-        <w:spacing w:after="0" w:line="256" w:lineRule="auto"/>
-        <w:rPr>
-          <w:rFonts w:ascii="Calibri" w:eastAsia="Calibri" w:hAnsi="Calibri" w:cs="Calibri"/>
-          <w:kern w:val="0"/>
-          <w:sz w:val="22"/>
-          <w:szCs w:val="22"/>
-          <w:lang w:val="en-IE" w:eastAsia="en-IE"/>
-          <w14:ligatures w14:val="none"/>
-        </w:rPr>
-      </w:pPr>
-      <w:r>
-        <w:rPr>
-          <w:rFonts w:ascii="Calibri" w:eastAsia="Calibri" w:hAnsi="Calibri" w:cs="Calibri"/>
-          <w:kern w:val="0"/>
-          <w:sz w:val="22"/>
-          <w:szCs w:val="22"/>
-          <w:lang w:val="en-IE" w:eastAsia="en-IE"/>
-          <w14:ligatures w14:val="none"/>
-        </w:rPr>
-        <w:t>Sports predictions (games, players, plays)</w:t>
-      </w:r>
-    </w:p>
-    <w:p>
-      <w:pPr>
-        <w:spacing w:after="0" w:line="256" w:lineRule="auto"/>
-        <w:rPr>
-          <w:rFonts w:ascii="Calibri" w:eastAsia="Calibri" w:hAnsi="Calibri" w:cs="Calibri"/>
-          <w:kern w:val="0"/>
-          <w:sz w:val="22"/>
-          <w:szCs w:val="22"/>
-          <w:lang w:val="en-IE" w:eastAsia="en-IE"/>
-          <w14:ligatures w14:val="none"/>
-        </w:rPr>
-      </w:pPr>
-    </w:p>
-    <w:p>
-      <w:pPr>
-        <w:spacing w:after="0" w:line="256" w:lineRule="auto"/>
-        <w:rPr>
-          <w:rFonts w:ascii="Calibri" w:eastAsia="Calibri" w:hAnsi="Calibri" w:cs="Calibri"/>
-          <w:kern w:val="0"/>
-          <w:sz w:val="22"/>
-          <w:szCs w:val="22"/>
-          <w:lang w:val="en-IE" w:eastAsia="en-IE"/>
-          <w14:ligatures w14:val="none"/>
-        </w:rPr>
-      </w:pPr>
-      <w:r>
-        <w:rPr>
-          <w:rFonts w:ascii="Calibri" w:eastAsia="Calibri" w:hAnsi="Calibri" w:cs="Calibri"/>
-          <w:kern w:val="0"/>
-          <w:sz w:val="22"/>
-          <w:szCs w:val="22"/>
-          <w:lang w:val="en-IE" w:eastAsia="en-IE"/>
-          <w14:ligatures w14:val="none"/>
-        </w:rPr>
-        <w:t>Remember that these project ideas are just starting points. Ensure that your project proposal outlines a comprehensive and in-depth analysis that will occur over two semesters.</w:t>
-      </w:r>
-    </w:p>
-    <w:p>
-      <w:pPr>
-        <w:spacing w:line="256" w:lineRule="auto"/>
-        <w:rPr>
-          <w:rFonts w:ascii="Calibri" w:eastAsia="Calibri" w:hAnsi="Calibri" w:cs="Calibri"/>
-          <w:kern w:val="0"/>
-          <w:sz w:val="22"/>
-          <w:szCs w:val="22"/>
-          <w:lang w:val="en-IE" w:eastAsia="en-IE"/>
-          <w14:ligatures w14:val="none"/>
-        </w:rPr>
-      </w:pPr>
-      <w:r>
-        <w:rPr>
-          <w:rFonts w:ascii="Calibri" w:eastAsia="Calibri" w:hAnsi="Calibri" w:cs="Calibri"/>
-          <w:kern w:val="0"/>
-          <w:sz w:val="22"/>
-          <w:szCs w:val="22"/>
-          <w:lang w:val="en-IE" w:eastAsia="en-IE"/>
-          <w14:ligatures w14:val="none"/>
-        </w:rPr>
-        <w:br w:type="page"/>
+          <w:lang w:val="en-IE" w:eastAsia="en-IE"/>
+          <w14:ligatures w14:val="none"/>
+        </w:rPr>
+      </w:pPr>
+      <w:r>
+        <w:rPr>
+          <w:rFonts w:ascii="Calibri" w:eastAsia="Times New Roman" w:hAnsi="Calibri" w:cs="Calibri"/>
+          <w:kern w:val="0"/>
+          <w:lang w:eastAsia="en-GB"/>
+          <w14:ligatures w14:val="none"/>
+        </w:rPr>
+        <w:t xml:space="preserve">          </w:t>
+      </w:r>
+      <w:r>
+        <w:rPr>
+          <w:rFonts w:ascii="Calibri" w:eastAsia="Times New Roman" w:hAnsi="Calibri" w:cs="Calibri"/>
+          <w:kern w:val="0"/>
+          <w:lang w:eastAsia="en-GB"/>
+          <w14:ligatures w14:val="none"/>
+        </w:rPr>
+        <w:t xml:space="preserve">- Synthetic Employee Well-being and Fatigue Dataset (2026). Generated </w:t>
+      </w:r>
+      <w:proofErr w:type="gramStart"/>
+      <w:r>
+        <w:rPr>
+          <w:rFonts w:ascii="Calibri" w:eastAsia="Times New Roman" w:hAnsi="Calibri" w:cs="Calibri"/>
+          <w:kern w:val="0"/>
+          <w:lang w:eastAsia="en-GB"/>
+          <w14:ligatures w14:val="none"/>
+        </w:rPr>
+        <w:t xml:space="preserve">dataset </w:t>
+      </w:r>
+      <w:r>
+        <w:rPr>
+          <w:rFonts w:ascii="Calibri" w:eastAsia="Times New Roman" w:hAnsi="Calibri" w:cs="Calibri"/>
+          <w:kern w:val="0"/>
+          <w:lang w:eastAsia="en-GB"/>
+          <w14:ligatures w14:val="none"/>
+        </w:rPr>
+        <w:t xml:space="preserve"> </w:t>
+      </w:r>
+      <w:r>
+        <w:rPr>
+          <w:rFonts w:ascii="Calibri" w:eastAsia="Times New Roman" w:hAnsi="Calibri" w:cs="Calibri"/>
+          <w:kern w:val="0"/>
+          <w:lang w:eastAsia="en-GB"/>
+          <w14:ligatures w14:val="none"/>
+        </w:rPr>
+        <w:t>simulation</w:t>
+      </w:r>
+      <w:proofErr w:type="gramEnd"/>
+      <w:r>
+        <w:rPr>
+          <w:rFonts w:ascii="Calibri" w:eastAsia="Times New Roman" w:hAnsi="Calibri" w:cs="Calibri"/>
+          <w:kern w:val="0"/>
+          <w:lang w:eastAsia="en-GB"/>
+          <w14:ligatures w14:val="none"/>
+        </w:rPr>
+        <w:t xml:space="preserve"> for corporate safety.</w:t>
+      </w:r>
+      <w:r>
+        <w:rPr>
+          <w:rFonts w:ascii="Calibri" w:eastAsia="Times New Roman" w:hAnsi="Calibri" w:cs="Calibri"/>
+          <w:kern w:val="0"/>
+          <w:lang w:eastAsia="en-GB"/>
+          <w14:ligatures w14:val="none"/>
+        </w:rPr>
+        <w:br/>
+      </w:r>
+      <w:r>
+        <w:rPr>
+          <w:rFonts w:ascii="Calibri" w:eastAsia="Times New Roman" w:hAnsi="Calibri" w:cs="Calibri"/>
+          <w:kern w:val="0"/>
+          <w:lang w:eastAsia="en-GB"/>
+          <w14:ligatures w14:val="none"/>
+        </w:rPr>
+        <w:t xml:space="preserve">          </w:t>
+      </w:r>
+      <w:r>
+        <w:rPr>
+          <w:rFonts w:ascii="Calibri" w:eastAsia="Times New Roman" w:hAnsi="Calibri" w:cs="Calibri"/>
+          <w:kern w:val="0"/>
+          <w:lang w:eastAsia="en-GB"/>
+          <w14:ligatures w14:val="none"/>
+        </w:rPr>
+        <w:t xml:space="preserve">- International </w:t>
+      </w:r>
+      <w:proofErr w:type="spellStart"/>
+      <w:r>
+        <w:rPr>
+          <w:rFonts w:ascii="Calibri" w:eastAsia="Times New Roman" w:hAnsi="Calibri" w:cs="Calibri"/>
+          <w:kern w:val="0"/>
+          <w:lang w:eastAsia="en-GB"/>
+          <w14:ligatures w14:val="none"/>
+        </w:rPr>
+        <w:t>Labour</w:t>
+      </w:r>
+      <w:proofErr w:type="spellEnd"/>
+      <w:r>
+        <w:rPr>
+          <w:rFonts w:ascii="Calibri" w:eastAsia="Times New Roman" w:hAnsi="Calibri" w:cs="Calibri"/>
+          <w:kern w:val="0"/>
+          <w:lang w:eastAsia="en-GB"/>
+          <w14:ligatures w14:val="none"/>
+        </w:rPr>
+        <w:t xml:space="preserve"> Organization (2024) Workplace Stress and Psychosocial Risks. Geneva: ILO.</w:t>
+      </w:r>
+      <w:r>
+        <w:rPr>
+          <w:rFonts w:ascii="Calibri" w:eastAsia="Times New Roman" w:hAnsi="Calibri" w:cs="Calibri"/>
+          <w:kern w:val="0"/>
+          <w:lang w:eastAsia="en-GB"/>
+          <w14:ligatures w14:val="none"/>
+        </w:rPr>
+        <w:br/>
+      </w:r>
+      <w:r>
+        <w:rPr>
+          <w:rFonts w:ascii="Calibri" w:eastAsia="Times New Roman" w:hAnsi="Calibri" w:cs="Calibri"/>
+          <w:kern w:val="0"/>
+          <w:lang w:eastAsia="en-GB"/>
+          <w14:ligatures w14:val="none"/>
+        </w:rPr>
+        <w:t xml:space="preserve">          </w:t>
+      </w:r>
+      <w:r>
+        <w:rPr>
+          <w:rFonts w:ascii="Calibri" w:eastAsia="Times New Roman" w:hAnsi="Calibri" w:cs="Calibri"/>
+          <w:kern w:val="0"/>
+          <w:lang w:eastAsia="en-GB"/>
+          <w14:ligatures w14:val="none"/>
+        </w:rPr>
+        <w:t xml:space="preserve">- Project Management Institute (2025) A Guide to the Project Management Body of Knowledge (PMBOK Guide). 8th </w:t>
+      </w:r>
+      <w:proofErr w:type="spellStart"/>
+      <w:r>
+        <w:rPr>
+          <w:rFonts w:ascii="Calibri" w:eastAsia="Times New Roman" w:hAnsi="Calibri" w:cs="Calibri"/>
+          <w:kern w:val="0"/>
+          <w:lang w:eastAsia="en-GB"/>
+          <w14:ligatures w14:val="none"/>
+        </w:rPr>
+        <w:t>edn</w:t>
+      </w:r>
+      <w:proofErr w:type="spellEnd"/>
+      <w:r>
+        <w:rPr>
+          <w:rFonts w:ascii="Calibri" w:eastAsia="Times New Roman" w:hAnsi="Calibri" w:cs="Calibri"/>
+          <w:kern w:val="0"/>
+          <w:lang w:eastAsia="en-GB"/>
+          <w14:ligatures w14:val="none"/>
+        </w:rPr>
+        <w:t>. Pennsylvania: PMI.</w:t>
       </w:r>
     </w:p>
     <w:p>
@@ -3269,7 +3305,6 @@
         <w:rPr>
           <w:rFonts w:ascii="Calibri" w:eastAsia="Calibri" w:hAnsi="Calibri" w:cs="Calibri"/>
           <w:kern w:val="0"/>
-          <w:szCs w:val="22"/>
           <w:lang w:val="en-IE" w:eastAsia="en-IE"/>
           <w14:ligatures w14:val="none"/>
         </w:rPr>
@@ -3279,11 +3314,9 @@
         <w:rPr>
           <w:rFonts w:ascii="Calibri" w:eastAsia="Calibri" w:hAnsi="Calibri" w:cs="Calibri"/>
           <w:kern w:val="0"/>
-          <w:szCs w:val="22"/>
-          <w:lang w:val="en-IE" w:eastAsia="en-IE"/>
-          <w14:ligatures w14:val="none"/>
-        </w:rPr>
-        <w:lastRenderedPageBreak/>
+          <w:lang w:val="en-IE" w:eastAsia="en-IE"/>
+          <w14:ligatures w14:val="none"/>
+        </w:rPr>
         <w:t>Further details of the assessment:</w:t>
       </w:r>
     </w:p>
@@ -3295,83 +3328,10 @@
         <w:rPr>
           <w:rFonts w:ascii="Calibri" w:eastAsia="Calibri" w:hAnsi="Calibri" w:cs="Calibri"/>
           <w:kern w:val="0"/>
-          <w:szCs w:val="22"/>
-          <w:lang w:val="en-IE" w:eastAsia="en-IE"/>
-          <w14:ligatures w14:val="none"/>
-        </w:rPr>
-      </w:pPr>
-    </w:p>
-    <w:p>
-      <w:pPr>
-        <w:numPr>
-          <w:ilvl w:val="0"/>
-          <w:numId w:val="3"/>
-        </w:numPr>
-        <w:spacing w:after="0" w:line="240" w:lineRule="auto"/>
-        <w:contextualSpacing/>
-        <w:jc w:val="both"/>
-        <w:rPr>
-          <w:rFonts w:ascii="Calibri" w:eastAsia="Calibri" w:hAnsi="Calibri" w:cs="Calibri"/>
-          <w:kern w:val="0"/>
-          <w:szCs w:val="22"/>
-          <w:u w:val="single"/>
-          <w:lang w:val="en-IE" w:eastAsia="en-IE"/>
-          <w14:ligatures w14:val="none"/>
-        </w:rPr>
-      </w:pPr>
-      <w:r>
-        <w:rPr>
-          <w:rFonts w:ascii="Calibri" w:eastAsia="Calibri" w:hAnsi="Calibri" w:cs="Calibri"/>
-          <w:b/>
-          <w:bCs/>
-          <w:kern w:val="0"/>
-          <w:szCs w:val="22"/>
-          <w:lang w:val="en-IE" w:eastAsia="en-IE"/>
-          <w14:ligatures w14:val="none"/>
-        </w:rPr>
-        <w:t xml:space="preserve">Support your analysis with references and properly reference ALL sources that you have used. </w:t>
-      </w:r>
-      <w:r>
-        <w:rPr>
-          <w:rFonts w:ascii="Calibri" w:eastAsia="Calibri" w:hAnsi="Calibri" w:cs="Calibri"/>
-          <w:b/>
-          <w:bCs/>
-          <w:kern w:val="0"/>
-          <w:szCs w:val="22"/>
-          <w:u w:val="single"/>
-          <w:lang w:val="en-IE" w:eastAsia="en-IE"/>
-          <w14:ligatures w14:val="none"/>
-        </w:rPr>
-        <w:t>WARNING – If you do not support your work, you will not receive a high mark!</w:t>
-      </w:r>
-    </w:p>
-    <w:p>
-      <w:pPr>
-        <w:numPr>
-          <w:ilvl w:val="0"/>
-          <w:numId w:val="3"/>
-        </w:numPr>
-        <w:spacing w:after="0" w:line="240" w:lineRule="auto"/>
-        <w:contextualSpacing/>
-        <w:jc w:val="both"/>
-        <w:rPr>
-          <w:rFonts w:ascii="Calibri" w:eastAsia="Calibri" w:hAnsi="Calibri" w:cs="Calibri"/>
-          <w:kern w:val="0"/>
-          <w:szCs w:val="22"/>
-          <w:lang w:val="en-IE" w:eastAsia="en-IE"/>
-          <w14:ligatures w14:val="none"/>
-        </w:rPr>
-      </w:pPr>
-      <w:r>
-        <w:rPr>
-          <w:rFonts w:ascii="Calibri" w:eastAsia="Calibri" w:hAnsi="Calibri" w:cs="Calibri"/>
-          <w:kern w:val="0"/>
-          <w:szCs w:val="22"/>
-          <w:lang w:val="en-IE" w:eastAsia="en-IE"/>
-          <w14:ligatures w14:val="none"/>
-        </w:rPr>
-        <w:t>WORD COUNT: 1,000 words. You may lose up to 10% of marks if your report is too short or long!</w:t>
-      </w:r>
+          <w:lang w:val="en-IE" w:eastAsia="en-IE"/>
+          <w14:ligatures w14:val="none"/>
+        </w:rPr>
+      </w:pPr>
     </w:p>
     <w:bookmarkEnd w:id="2"/>
     <w:p>
@@ -3383,20 +3343,64 @@
         <w:rPr>
           <w:rFonts w:ascii="Calibri" w:eastAsia="Calibri" w:hAnsi="Calibri" w:cs="Calibri"/>
           <w:b/>
-          <w:kern w:val="0"/>
-          <w:sz w:val="36"/>
-          <w:szCs w:val="36"/>
-          <w:lang w:val="en-IE" w:eastAsia="en-IE"/>
-          <w14:ligatures w14:val="none"/>
-        </w:rPr>
-      </w:pPr>
-      <w:r>
+          <w:bCs/>
+          <w:kern w:val="0"/>
+          <w:lang w:val="en-IE" w:eastAsia="en-IE"/>
+          <w14:ligatures w14:val="none"/>
+        </w:rPr>
+      </w:pPr>
+    </w:p>
+    <w:p>
+      <w:pPr>
+        <w:keepNext/>
+        <w:keepLines/>
+        <w:spacing w:before="360" w:after="80" w:line="256" w:lineRule="auto"/>
+        <w:outlineLvl w:val="1"/>
         <w:rPr>
           <w:rFonts w:ascii="Calibri" w:eastAsia="Calibri" w:hAnsi="Calibri" w:cs="Calibri"/>
           <w:b/>
-          <w:kern w:val="0"/>
-          <w:sz w:val="36"/>
-          <w:szCs w:val="36"/>
+          <w:bCs/>
+          <w:kern w:val="0"/>
+          <w:lang w:val="en-IE" w:eastAsia="en-IE"/>
+          <w14:ligatures w14:val="none"/>
+        </w:rPr>
+      </w:pPr>
+    </w:p>
+    <w:p>
+      <w:pPr>
+        <w:keepNext/>
+        <w:keepLines/>
+        <w:spacing w:before="360" w:after="80" w:line="256" w:lineRule="auto"/>
+        <w:outlineLvl w:val="1"/>
+        <w:rPr>
+          <w:rFonts w:ascii="Calibri" w:eastAsia="Calibri" w:hAnsi="Calibri" w:cs="Calibri"/>
+          <w:b/>
+          <w:bCs/>
+          <w:kern w:val="0"/>
+          <w:lang w:val="en-IE" w:eastAsia="en-IE"/>
+          <w14:ligatures w14:val="none"/>
+        </w:rPr>
+      </w:pPr>
+    </w:p>
+    <w:p>
+      <w:pPr>
+        <w:keepNext/>
+        <w:keepLines/>
+        <w:spacing w:before="360" w:after="80" w:line="256" w:lineRule="auto"/>
+        <w:outlineLvl w:val="1"/>
+        <w:rPr>
+          <w:rFonts w:ascii="Calibri" w:eastAsia="Calibri" w:hAnsi="Calibri" w:cs="Calibri"/>
+          <w:b/>
+          <w:kern w:val="0"/>
+          <w:lang w:val="en-IE" w:eastAsia="en-IE"/>
+          <w14:ligatures w14:val="none"/>
+        </w:rPr>
+      </w:pPr>
+      <w:r>
+        <w:rPr>
+          <w:rFonts w:ascii="Calibri" w:eastAsia="Calibri" w:hAnsi="Calibri" w:cs="Calibri"/>
+          <w:b/>
+          <w:kern w:val="0"/>
           <w:lang w:val="en-IE" w:eastAsia="en-IE"/>
           <w14:ligatures w14:val="none"/>
         </w:rPr>
@@ -3409,18 +3413,14 @@
         <w:rPr>
           <w:rFonts w:ascii="Calibri" w:eastAsia="Calibri" w:hAnsi="Calibri" w:cs="Calibri"/>
           <w:kern w:val="0"/>
-          <w:sz w:val="22"/>
-          <w:szCs w:val="22"/>
-          <w:lang w:val="en-IE" w:eastAsia="en-IE"/>
-          <w14:ligatures w14:val="none"/>
-        </w:rPr>
-      </w:pPr>
-      <w:r>
-        <w:rPr>
-          <w:rFonts w:ascii="Calibri" w:eastAsia="Calibri" w:hAnsi="Calibri" w:cs="Calibri"/>
-          <w:kern w:val="0"/>
-          <w:sz w:val="22"/>
-          <w:szCs w:val="22"/>
+          <w:lang w:val="en-IE" w:eastAsia="en-IE"/>
+          <w14:ligatures w14:val="none"/>
+        </w:rPr>
+      </w:pPr>
+      <w:r>
+        <w:rPr>
+          <w:rFonts w:ascii="Calibri" w:eastAsia="Calibri" w:hAnsi="Calibri" w:cs="Calibri"/>
+          <w:kern w:val="0"/>
           <w:lang w:val="en-IE" w:eastAsia="en-IE"/>
           <w14:ligatures w14:val="none"/>
         </w:rPr>
@@ -3437,18 +3437,14 @@
         <w:rPr>
           <w:rFonts w:ascii="Calibri" w:eastAsia="Calibri" w:hAnsi="Calibri" w:cs="Calibri"/>
           <w:kern w:val="0"/>
-          <w:sz w:val="22"/>
-          <w:szCs w:val="22"/>
-          <w:lang w:val="en-IE" w:eastAsia="en-IE"/>
-          <w14:ligatures w14:val="none"/>
-        </w:rPr>
-      </w:pPr>
-      <w:r>
-        <w:rPr>
-          <w:rFonts w:ascii="Calibri" w:eastAsia="Calibri" w:hAnsi="Calibri" w:cs="Calibri"/>
-          <w:kern w:val="0"/>
-          <w:sz w:val="22"/>
-          <w:szCs w:val="22"/>
+          <w:lang w:val="en-IE" w:eastAsia="en-IE"/>
+          <w14:ligatures w14:val="none"/>
+        </w:rPr>
+      </w:pPr>
+      <w:r>
+        <w:rPr>
+          <w:rFonts w:ascii="Calibri" w:eastAsia="Calibri" w:hAnsi="Calibri" w:cs="Calibri"/>
+          <w:kern w:val="0"/>
           <w:lang w:val="en-IE" w:eastAsia="en-IE"/>
           <w14:ligatures w14:val="none"/>
         </w:rPr>
@@ -3467,8 +3463,6 @@
           <w:rFonts w:ascii="Calibri" w:eastAsia="Calibri" w:hAnsi="Calibri" w:cs="Calibri"/>
           <w:bCs/>
           <w:kern w:val="0"/>
-          <w:sz w:val="22"/>
-          <w:szCs w:val="22"/>
           <w:lang w:val="en-IE" w:eastAsia="en-IE"/>
           <w14:ligatures w14:val="none"/>
         </w:rPr>
@@ -3478,8 +3472,6 @@
           <w:rFonts w:ascii="Calibri" w:eastAsia="Calibri" w:hAnsi="Calibri" w:cs="Calibri"/>
           <w:bCs/>
           <w:kern w:val="0"/>
-          <w:sz w:val="22"/>
-          <w:szCs w:val="22"/>
           <w:lang w:val="en-IE" w:eastAsia="en-IE"/>
           <w14:ligatures w14:val="none"/>
         </w:rPr>
@@ -3497,18 +3489,14 @@
         <w:rPr>
           <w:rFonts w:ascii="Calibri" w:eastAsia="Calibri" w:hAnsi="Calibri" w:cs="Calibri"/>
           <w:kern w:val="0"/>
-          <w:sz w:val="22"/>
-          <w:szCs w:val="22"/>
-          <w:lang w:val="en-IE" w:eastAsia="en-IE"/>
-          <w14:ligatures w14:val="none"/>
-        </w:rPr>
-      </w:pPr>
-      <w:r>
-        <w:rPr>
-          <w:rFonts w:ascii="Calibri" w:eastAsia="Calibri" w:hAnsi="Calibri" w:cs="Calibri"/>
-          <w:kern w:val="0"/>
-          <w:sz w:val="22"/>
-          <w:szCs w:val="22"/>
+          <w:lang w:val="en-IE" w:eastAsia="en-IE"/>
+          <w14:ligatures w14:val="none"/>
+        </w:rPr>
+      </w:pPr>
+      <w:r>
+        <w:rPr>
+          <w:rFonts w:ascii="Calibri" w:eastAsia="Calibri" w:hAnsi="Calibri" w:cs="Calibri"/>
+          <w:kern w:val="0"/>
           <w:lang w:val="en-IE" w:eastAsia="en-IE"/>
           <w14:ligatures w14:val="none"/>
         </w:rPr>
@@ -3525,18 +3513,14 @@
         <w:rPr>
           <w:rFonts w:ascii="Calibri" w:eastAsia="Calibri" w:hAnsi="Calibri" w:cs="Calibri"/>
           <w:kern w:val="0"/>
-          <w:sz w:val="22"/>
-          <w:szCs w:val="22"/>
-          <w:lang w:val="en-IE" w:eastAsia="en-IE"/>
-          <w14:ligatures w14:val="none"/>
-        </w:rPr>
-      </w:pPr>
-      <w:r>
-        <w:rPr>
-          <w:rFonts w:ascii="Calibri" w:eastAsia="Calibri" w:hAnsi="Calibri" w:cs="Calibri"/>
-          <w:kern w:val="0"/>
-          <w:sz w:val="22"/>
-          <w:szCs w:val="22"/>
+          <w:lang w:val="en-IE" w:eastAsia="en-IE"/>
+          <w14:ligatures w14:val="none"/>
+        </w:rPr>
+      </w:pPr>
+      <w:r>
+        <w:rPr>
+          <w:rFonts w:ascii="Calibri" w:eastAsia="Calibri" w:hAnsi="Calibri" w:cs="Calibri"/>
+          <w:kern w:val="0"/>
           <w:lang w:val="en-IE" w:eastAsia="en-IE"/>
           <w14:ligatures w14:val="none"/>
         </w:rPr>
@@ -3553,18 +3537,14 @@
         <w:rPr>
           <w:rFonts w:ascii="Calibri" w:eastAsia="Calibri" w:hAnsi="Calibri" w:cs="Calibri"/>
           <w:kern w:val="0"/>
-          <w:sz w:val="22"/>
-          <w:szCs w:val="22"/>
-          <w:lang w:val="en-IE" w:eastAsia="en-IE"/>
-          <w14:ligatures w14:val="none"/>
-        </w:rPr>
-      </w:pPr>
-      <w:r>
-        <w:rPr>
-          <w:rFonts w:ascii="Calibri" w:eastAsia="Calibri" w:hAnsi="Calibri" w:cs="Calibri"/>
-          <w:kern w:val="0"/>
-          <w:sz w:val="22"/>
-          <w:szCs w:val="22"/>
+          <w:lang w:val="en-IE" w:eastAsia="en-IE"/>
+          <w14:ligatures w14:val="none"/>
+        </w:rPr>
+      </w:pPr>
+      <w:r>
+        <w:rPr>
+          <w:rFonts w:ascii="Calibri" w:eastAsia="Calibri" w:hAnsi="Calibri" w:cs="Calibri"/>
+          <w:kern w:val="0"/>
           <w:lang w:val="en-IE" w:eastAsia="en-IE"/>
           <w14:ligatures w14:val="none"/>
         </w:rPr>
@@ -3581,18 +3561,14 @@
         <w:rPr>
           <w:rFonts w:ascii="Calibri" w:eastAsia="Calibri" w:hAnsi="Calibri" w:cs="Calibri"/>
           <w:kern w:val="0"/>
-          <w:sz w:val="22"/>
-          <w:szCs w:val="22"/>
-          <w:lang w:val="en-IE" w:eastAsia="en-IE"/>
-          <w14:ligatures w14:val="none"/>
-        </w:rPr>
-      </w:pPr>
-      <w:r>
-        <w:rPr>
-          <w:rFonts w:ascii="Calibri" w:eastAsia="Calibri" w:hAnsi="Calibri" w:cs="Calibri"/>
-          <w:kern w:val="0"/>
-          <w:sz w:val="22"/>
-          <w:szCs w:val="22"/>
+          <w:lang w:val="en-IE" w:eastAsia="en-IE"/>
+          <w14:ligatures w14:val="none"/>
+        </w:rPr>
+      </w:pPr>
+      <w:r>
+        <w:rPr>
+          <w:rFonts w:ascii="Calibri" w:eastAsia="Calibri" w:hAnsi="Calibri" w:cs="Calibri"/>
+          <w:kern w:val="0"/>
           <w:lang w:val="en-IE" w:eastAsia="en-IE"/>
           <w14:ligatures w14:val="none"/>
         </w:rPr>
@@ -3609,18 +3585,14 @@
         <w:rPr>
           <w:rFonts w:ascii="Calibri" w:eastAsia="Calibri" w:hAnsi="Calibri" w:cs="Calibri"/>
           <w:kern w:val="0"/>
-          <w:sz w:val="22"/>
-          <w:szCs w:val="22"/>
-          <w:lang w:val="en-IE" w:eastAsia="en-IE"/>
-          <w14:ligatures w14:val="none"/>
-        </w:rPr>
-      </w:pPr>
-      <w:r>
-        <w:rPr>
-          <w:rFonts w:ascii="Calibri" w:eastAsia="Calibri" w:hAnsi="Calibri" w:cs="Calibri"/>
-          <w:kern w:val="0"/>
-          <w:sz w:val="22"/>
-          <w:szCs w:val="22"/>
+          <w:lang w:val="en-IE" w:eastAsia="en-IE"/>
+          <w14:ligatures w14:val="none"/>
+        </w:rPr>
+      </w:pPr>
+      <w:r>
+        <w:rPr>
+          <w:rFonts w:ascii="Calibri" w:eastAsia="Calibri" w:hAnsi="Calibri" w:cs="Calibri"/>
+          <w:kern w:val="0"/>
           <w:lang w:val="en-IE" w:eastAsia="en-IE"/>
           <w14:ligatures w14:val="none"/>
         </w:rPr>
@@ -3632,21 +3604,39 @@
             <w:rFonts w:ascii="Calibri" w:eastAsia="Calibri" w:hAnsi="Calibri" w:cs="Calibri"/>
             <w:color w:val="0563C1"/>
             <w:kern w:val="0"/>
-            <w:sz w:val="22"/>
-            <w:szCs w:val="22"/>
             <w:u w:val="single"/>
             <w:lang w:val="en-IE" w:eastAsia="en-IE"/>
             <w14:ligatures w14:val="none"/>
           </w:rPr>
-          <w:t>Harvard Referencing</w:t>
+          <w:t>Harvard Refer</w:t>
+        </w:r>
+        <w:r>
+          <w:rPr>
+            <w:rFonts w:ascii="Calibri" w:eastAsia="Calibri" w:hAnsi="Calibri" w:cs="Calibri"/>
+            <w:color w:val="0563C1"/>
+            <w:kern w:val="0"/>
+            <w:u w:val="single"/>
+            <w:lang w:val="en-IE" w:eastAsia="en-IE"/>
+            <w14:ligatures w14:val="none"/>
+          </w:rPr>
+          <w:t>e</w:t>
+        </w:r>
+        <w:r>
+          <w:rPr>
+            <w:rFonts w:ascii="Calibri" w:eastAsia="Calibri" w:hAnsi="Calibri" w:cs="Calibri"/>
+            <w:color w:val="0563C1"/>
+            <w:kern w:val="0"/>
+            <w:u w:val="single"/>
+            <w:lang w:val="en-IE" w:eastAsia="en-IE"/>
+            <w14:ligatures w14:val="none"/>
+          </w:rPr>
+          <w:t>ncing</w:t>
         </w:r>
       </w:hyperlink>
       <w:r>
         <w:rPr>
           <w:rFonts w:ascii="Calibri" w:eastAsia="Calibri" w:hAnsi="Calibri" w:cs="Calibri"/>
           <w:kern w:val="0"/>
-          <w:sz w:val="22"/>
-          <w:szCs w:val="22"/>
           <w:lang w:val="en-IE" w:eastAsia="en-IE"/>
           <w14:ligatures w14:val="none"/>
         </w:rPr>
@@ -3663,18 +3653,14 @@
         <w:rPr>
           <w:rFonts w:ascii="Calibri" w:eastAsia="Calibri" w:hAnsi="Calibri" w:cs="Calibri"/>
           <w:kern w:val="0"/>
-          <w:sz w:val="22"/>
-          <w:szCs w:val="22"/>
-          <w:lang w:val="en-IE" w:eastAsia="en-IE"/>
-          <w14:ligatures w14:val="none"/>
-        </w:rPr>
-      </w:pPr>
-      <w:r>
-        <w:rPr>
-          <w:rFonts w:ascii="Calibri" w:eastAsia="Calibri" w:hAnsi="Calibri" w:cs="Calibri"/>
-          <w:kern w:val="0"/>
-          <w:sz w:val="22"/>
-          <w:szCs w:val="22"/>
+          <w:lang w:val="en-IE" w:eastAsia="en-IE"/>
+          <w14:ligatures w14:val="none"/>
+        </w:rPr>
+      </w:pPr>
+      <w:r>
+        <w:rPr>
+          <w:rFonts w:ascii="Calibri" w:eastAsia="Calibri" w:hAnsi="Calibri" w:cs="Calibri"/>
+          <w:kern w:val="0"/>
           <w:lang w:val="en-IE" w:eastAsia="en-IE"/>
           <w14:ligatures w14:val="none"/>
         </w:rPr>
@@ -3691,18 +3677,14 @@
         <w:rPr>
           <w:rFonts w:ascii="Calibri" w:eastAsia="Calibri" w:hAnsi="Calibri" w:cs="Calibri"/>
           <w:kern w:val="0"/>
-          <w:sz w:val="22"/>
-          <w:szCs w:val="22"/>
-          <w:lang w:val="en-IE" w:eastAsia="en-IE"/>
-          <w14:ligatures w14:val="none"/>
-        </w:rPr>
-      </w:pPr>
-      <w:r>
-        <w:rPr>
-          <w:rFonts w:ascii="Calibri" w:eastAsia="Calibri" w:hAnsi="Calibri" w:cs="Calibri"/>
-          <w:kern w:val="0"/>
-          <w:sz w:val="22"/>
-          <w:szCs w:val="22"/>
+          <w:lang w:val="en-IE" w:eastAsia="en-IE"/>
+          <w14:ligatures w14:val="none"/>
+        </w:rPr>
+      </w:pPr>
+      <w:r>
+        <w:rPr>
+          <w:rFonts w:ascii="Calibri" w:eastAsia="Calibri" w:hAnsi="Calibri" w:cs="Calibri"/>
+          <w:kern w:val="0"/>
           <w:lang w:val="en-IE" w:eastAsia="en-IE"/>
           <w14:ligatures w14:val="none"/>
         </w:rPr>
@@ -3719,8 +3701,6 @@
           <w:rFonts w:ascii="Calibri" w:eastAsia="Calibri" w:hAnsi="Calibri" w:cs="Calibri"/>
           <w:b/>
           <w:kern w:val="0"/>
-          <w:sz w:val="36"/>
-          <w:szCs w:val="36"/>
           <w:lang w:val="en-IE" w:eastAsia="en-IE"/>
           <w14:ligatures w14:val="none"/>
         </w:rPr>
@@ -3730,8 +3710,6 @@
           <w:rFonts w:ascii="Calibri" w:eastAsia="Calibri" w:hAnsi="Calibri" w:cs="Calibri"/>
           <w:b/>
           <w:kern w:val="0"/>
-          <w:sz w:val="36"/>
-          <w:szCs w:val="36"/>
           <w:lang w:val="en-IE" w:eastAsia="en-IE"/>
           <w14:ligatures w14:val="none"/>
         </w:rPr>
@@ -3744,18 +3722,14 @@
         <w:rPr>
           <w:rFonts w:ascii="Calibri" w:eastAsia="Calibri" w:hAnsi="Calibri" w:cs="Calibri"/>
           <w:kern w:val="0"/>
-          <w:sz w:val="22"/>
-          <w:szCs w:val="22"/>
-          <w:lang w:val="en-IE" w:eastAsia="en-IE"/>
-          <w14:ligatures w14:val="none"/>
-        </w:rPr>
-      </w:pPr>
-      <w:r>
-        <w:rPr>
-          <w:rFonts w:ascii="Calibri" w:eastAsia="Calibri" w:hAnsi="Calibri" w:cs="Calibri"/>
-          <w:kern w:val="0"/>
-          <w:sz w:val="22"/>
-          <w:szCs w:val="22"/>
+          <w:lang w:val="en-IE" w:eastAsia="en-IE"/>
+          <w14:ligatures w14:val="none"/>
+        </w:rPr>
+      </w:pPr>
+      <w:r>
+        <w:rPr>
+          <w:rFonts w:ascii="Calibri" w:eastAsia="Calibri" w:hAnsi="Calibri" w:cs="Calibri"/>
+          <w:kern w:val="0"/>
           <w:lang w:val="en-IE" w:eastAsia="en-IE"/>
           <w14:ligatures w14:val="none"/>
         </w:rPr>
@@ -3768,18 +3742,14 @@
         <w:rPr>
           <w:rFonts w:ascii="Calibri" w:eastAsia="Calibri" w:hAnsi="Calibri" w:cs="Calibri"/>
           <w:kern w:val="0"/>
-          <w:sz w:val="22"/>
-          <w:szCs w:val="22"/>
-          <w:lang w:val="en-IE" w:eastAsia="en-IE"/>
-          <w14:ligatures w14:val="none"/>
-        </w:rPr>
-      </w:pPr>
-      <w:r>
-        <w:rPr>
-          <w:rFonts w:ascii="Calibri" w:eastAsia="Calibri" w:hAnsi="Calibri" w:cs="Calibri"/>
-          <w:kern w:val="0"/>
-          <w:sz w:val="22"/>
-          <w:szCs w:val="22"/>
+          <w:lang w:val="en-IE" w:eastAsia="en-IE"/>
+          <w14:ligatures w14:val="none"/>
+        </w:rPr>
+      </w:pPr>
+      <w:r>
+        <w:rPr>
+          <w:rFonts w:ascii="Calibri" w:eastAsia="Calibri" w:hAnsi="Calibri" w:cs="Calibri"/>
+          <w:kern w:val="0"/>
           <w:lang w:val="en-IE" w:eastAsia="en-IE"/>
           <w14:ligatures w14:val="none"/>
         </w:rPr>
@@ -3792,18 +3762,14 @@
         <w:rPr>
           <w:rFonts w:ascii="Calibri" w:eastAsia="Calibri" w:hAnsi="Calibri" w:cs="Calibri"/>
           <w:kern w:val="0"/>
-          <w:sz w:val="22"/>
-          <w:szCs w:val="22"/>
-          <w:lang w:val="en-IE" w:eastAsia="en-IE"/>
-          <w14:ligatures w14:val="none"/>
-        </w:rPr>
-      </w:pPr>
-      <w:r>
-        <w:rPr>
-          <w:rFonts w:ascii="Calibri" w:eastAsia="Calibri" w:hAnsi="Calibri" w:cs="Calibri"/>
-          <w:kern w:val="0"/>
-          <w:sz w:val="22"/>
-          <w:szCs w:val="22"/>
+          <w:lang w:val="en-IE" w:eastAsia="en-IE"/>
+          <w14:ligatures w14:val="none"/>
+        </w:rPr>
+      </w:pPr>
+      <w:r>
+        <w:rPr>
+          <w:rFonts w:ascii="Calibri" w:eastAsia="Calibri" w:hAnsi="Calibri" w:cs="Calibri"/>
+          <w:kern w:val="0"/>
           <w:lang w:val="en-IE" w:eastAsia="en-IE"/>
           <w14:ligatures w14:val="none"/>
         </w:rPr>
@@ -3816,18 +3782,14 @@
         <w:rPr>
           <w:rFonts w:ascii="Calibri" w:eastAsia="Calibri" w:hAnsi="Calibri" w:cs="Calibri"/>
           <w:kern w:val="0"/>
-          <w:sz w:val="22"/>
-          <w:szCs w:val="22"/>
-          <w:lang w:val="en-IE" w:eastAsia="en-IE"/>
-          <w14:ligatures w14:val="none"/>
-        </w:rPr>
-      </w:pPr>
-      <w:r>
-        <w:rPr>
-          <w:rFonts w:ascii="Calibri" w:eastAsia="Calibri" w:hAnsi="Calibri" w:cs="Calibri"/>
-          <w:kern w:val="0"/>
-          <w:sz w:val="22"/>
-          <w:szCs w:val="22"/>
+          <w:lang w:val="en-IE" w:eastAsia="en-IE"/>
+          <w14:ligatures w14:val="none"/>
+        </w:rPr>
+      </w:pPr>
+      <w:r>
+        <w:rPr>
+          <w:rFonts w:ascii="Calibri" w:eastAsia="Calibri" w:hAnsi="Calibri" w:cs="Calibri"/>
+          <w:kern w:val="0"/>
           <w:lang w:val="en-IE" w:eastAsia="en-IE"/>
           <w14:ligatures w14:val="none"/>
         </w:rPr>
@@ -3840,18 +3802,14 @@
         <w:rPr>
           <w:rFonts w:ascii="Calibri" w:eastAsia="Calibri" w:hAnsi="Calibri" w:cs="Calibri"/>
           <w:kern w:val="0"/>
-          <w:sz w:val="22"/>
-          <w:szCs w:val="22"/>
-          <w:lang w:val="en-IE" w:eastAsia="en-IE"/>
-          <w14:ligatures w14:val="none"/>
-        </w:rPr>
-      </w:pPr>
-      <w:r>
-        <w:rPr>
-          <w:rFonts w:ascii="Calibri" w:eastAsia="Calibri" w:hAnsi="Calibri" w:cs="Calibri"/>
-          <w:kern w:val="0"/>
-          <w:sz w:val="22"/>
-          <w:szCs w:val="22"/>
+          <w:lang w:val="en-IE" w:eastAsia="en-IE"/>
+          <w14:ligatures w14:val="none"/>
+        </w:rPr>
+      </w:pPr>
+      <w:r>
+        <w:rPr>
+          <w:rFonts w:ascii="Calibri" w:eastAsia="Calibri" w:hAnsi="Calibri" w:cs="Calibri"/>
+          <w:kern w:val="0"/>
           <w:lang w:val="en-IE" w:eastAsia="en-IE"/>
           <w14:ligatures w14:val="none"/>
         </w:rPr>
@@ -3864,18 +3822,14 @@
         <w:rPr>
           <w:rFonts w:ascii="Calibri" w:eastAsia="Calibri" w:hAnsi="Calibri" w:cs="Calibri"/>
           <w:kern w:val="0"/>
-          <w:sz w:val="22"/>
-          <w:szCs w:val="22"/>
-          <w:lang w:val="en-IE" w:eastAsia="en-IE"/>
-          <w14:ligatures w14:val="none"/>
-        </w:rPr>
-      </w:pPr>
-      <w:r>
-        <w:rPr>
-          <w:rFonts w:ascii="Calibri" w:eastAsia="Calibri" w:hAnsi="Calibri" w:cs="Calibri"/>
-          <w:kern w:val="0"/>
-          <w:sz w:val="22"/>
-          <w:szCs w:val="22"/>
+          <w:lang w:val="en-IE" w:eastAsia="en-IE"/>
+          <w14:ligatures w14:val="none"/>
+        </w:rPr>
+      </w:pPr>
+      <w:r>
+        <w:rPr>
+          <w:rFonts w:ascii="Calibri" w:eastAsia="Calibri" w:hAnsi="Calibri" w:cs="Calibri"/>
+          <w:kern w:val="0"/>
           <w:lang w:val="en-IE" w:eastAsia="en-IE"/>
           <w14:ligatures w14:val="none"/>
         </w:rPr>
@@ -3888,18 +3842,14 @@
         <w:rPr>
           <w:rFonts w:ascii="Calibri" w:eastAsia="Calibri" w:hAnsi="Calibri" w:cs="Calibri"/>
           <w:kern w:val="0"/>
-          <w:sz w:val="22"/>
-          <w:szCs w:val="22"/>
-          <w:lang w:val="en-IE" w:eastAsia="en-IE"/>
-          <w14:ligatures w14:val="none"/>
-        </w:rPr>
-      </w:pPr>
-      <w:r>
-        <w:rPr>
-          <w:rFonts w:ascii="Calibri" w:eastAsia="Calibri" w:hAnsi="Calibri" w:cs="Calibri"/>
-          <w:kern w:val="0"/>
-          <w:sz w:val="22"/>
-          <w:szCs w:val="22"/>
+          <w:lang w:val="en-IE" w:eastAsia="en-IE"/>
+          <w14:ligatures w14:val="none"/>
+        </w:rPr>
+      </w:pPr>
+      <w:r>
+        <w:rPr>
+          <w:rFonts w:ascii="Calibri" w:eastAsia="Calibri" w:hAnsi="Calibri" w:cs="Calibri"/>
+          <w:kern w:val="0"/>
           <w:lang w:val="en-IE" w:eastAsia="en-IE"/>
           <w14:ligatures w14:val="none"/>
         </w:rPr>
@@ -3912,8 +3862,6 @@
         <w:rPr>
           <w:rFonts w:ascii="Calibri" w:eastAsia="Calibri" w:hAnsi="Calibri" w:cs="Calibri"/>
           <w:kern w:val="0"/>
-          <w:sz w:val="22"/>
-          <w:szCs w:val="22"/>
           <w:lang w:val="en-IE" w:eastAsia="en-IE"/>
           <w14:ligatures w14:val="none"/>
         </w:rPr>

</xml_diff>